<commit_message>
add MSE, MRSD and cols describing intercept
</commit_message>
<xml_diff>
--- a/docx/external-validation/non-certified-external-validation.docx
+++ b/docx/external-validation/non-certified-external-validation.docx
@@ -38,16 +38,19 @@
         <w:gridCol w:w="1401"/>
         <w:gridCol w:w="1291"/>
         <w:gridCol w:w="2502"/>
+        <w:gridCol w:w="1854"/>
+        <w:gridCol w:w="1621"/>
         <w:gridCol w:w="655"/>
         <w:gridCol w:w="1046"/>
         <w:gridCol w:w="961"/>
         <w:gridCol w:w="1084"/>
         <w:gridCol w:w="1034"/>
         <w:gridCol w:w="961"/>
+        <w:gridCol w:w="1157"/>
       </w:tblGrid>
       <w:tr>
         <w:trPr>
-          <w:trHeight w:val="618" w:hRule="auto"/>
+          <w:trHeight w:val="619" w:hRule="auto"/>
           <w:tblHeader/>
         </w:trPr>
         header 1
@@ -223,7 +226,7 @@
                 <w:szCs w:val="22"/>
                 <w:color w:val="000000"/>
               </w:rPr>
-              <w:t xml:space="preserve">N</w:t>
+              <w:t xml:space="preserve">Intercept value</w:t>
             </w:r>
           </w:p>
         </w:tc>
@@ -267,7 +270,7 @@
                 <w:szCs w:val="22"/>
                 <w:color w:val="000000"/>
               </w:rPr>
-              <w:t xml:space="preserve">RMSE</w:t>
+              <w:t xml:space="preserve">Intercept SE</w:t>
             </w:r>
           </w:p>
         </w:tc>
@@ -311,7 +314,7 @@
                 <w:szCs w:val="22"/>
                 <w:color w:val="000000"/>
               </w:rPr>
-              <w:t xml:space="preserve">MAE</w:t>
+              <w:t xml:space="preserve">N</w:t>
             </w:r>
           </w:p>
         </w:tc>
@@ -355,7 +358,7 @@
                 <w:szCs w:val="22"/>
                 <w:color w:val="000000"/>
               </w:rPr>
-              <w:t xml:space="preserve">MSE</w:t>
+              <w:t xml:space="preserve">RMSE</w:t>
             </w:r>
           </w:p>
         </w:tc>
@@ -399,7 +402,7 @@
                 <w:szCs w:val="22"/>
                 <w:color w:val="000000"/>
               </w:rPr>
-              <w:t xml:space="preserve">MSD</w:t>
+              <w:t xml:space="preserve">MAE</w:t>
             </w:r>
           </w:p>
         </w:tc>
@@ -443,7 +446,139 @@
                 <w:szCs w:val="22"/>
                 <w:color w:val="000000"/>
               </w:rPr>
+              <w:t xml:space="preserve">MSE</w:t>
+            </w:r>
+          </w:p>
+        </w:tc>
+        <w:tc>
+          <w:tcPr>
+            <w:tcBorders>
+              <w:bottom w:val="single" w:sz="12" w:space="0" w:color="666666"/>
+              <w:top w:val="single" w:sz="12" w:space="0" w:color="666666"/>
+              <w:left w:val="none" w:sz="0" w:space="0" w:color="000000"/>
+              <w:right w:val="none" w:sz="0" w:space="0" w:color="000000"/>
+            </w:tcBorders>
+            <w:shd w:val="clear" w:color="auto" w:fill="FFFFFF"/>
+            <w:tcMar>
+              <w:top w:w="0" w:type="dxa"/>
+              <w:bottom w:w="0" w:type="dxa"/>
+              <w:left w:w="0" w:type="dxa"/>
+              <w:right w:w="0" w:type="dxa"/>
+            </w:tcMar>
+            <w:vAlign w:val="center"/>
+          </w:tcPr>
+          <w:p>
+            <w:pPr>
+              <w:pStyle w:val="Normal"/>
+              <w:jc w:val="right"/>
+              <w:pBdr>
+                <w:bottom w:val="none" w:sz="0" w:space="0" w:color="000000"/>
+                <w:top w:val="none" w:sz="0" w:space="0" w:color="000000"/>
+                <w:left w:val="none" w:sz="0" w:space="0" w:color="000000"/>
+                <w:right w:val="none" w:sz="0" w:space="0" w:color="000000"/>
+              </w:pBdr>
+              <w:spacing w:after="100" w:before="100" w:line="240"/>
+              <w:ind w:left="100" w:right="100" w:firstLine="0" w:firstLineChars="0"/>
+            </w:pPr>
+            <w:r>
+              <w:rPr>
+                <w:rFonts w:ascii="Helvetica" w:hAnsi="Helvetica" w:eastAsia="Helvetica" w:cs="Helvetica"/>
+                <w:i w:val="false"/>
+                <w:b w:val="false"/>
+                <w:u w:val="none"/>
+                <w:sz w:val="22"/>
+                <w:szCs w:val="22"/>
+                <w:color w:val="000000"/>
+              </w:rPr>
+              <w:t xml:space="preserve">MSD</w:t>
+            </w:r>
+          </w:p>
+        </w:tc>
+        <w:tc>
+          <w:tcPr>
+            <w:tcBorders>
+              <w:bottom w:val="single" w:sz="12" w:space="0" w:color="666666"/>
+              <w:top w:val="single" w:sz="12" w:space="0" w:color="666666"/>
+              <w:left w:val="none" w:sz="0" w:space="0" w:color="000000"/>
+              <w:right w:val="none" w:sz="0" w:space="0" w:color="000000"/>
+            </w:tcBorders>
+            <w:shd w:val="clear" w:color="auto" w:fill="FFFFFF"/>
+            <w:tcMar>
+              <w:top w:w="0" w:type="dxa"/>
+              <w:bottom w:w="0" w:type="dxa"/>
+              <w:left w:w="0" w:type="dxa"/>
+              <w:right w:w="0" w:type="dxa"/>
+            </w:tcMar>
+            <w:vAlign w:val="center"/>
+          </w:tcPr>
+          <w:p>
+            <w:pPr>
+              <w:pStyle w:val="Normal"/>
+              <w:jc w:val="right"/>
+              <w:pBdr>
+                <w:bottom w:val="none" w:sz="0" w:space="0" w:color="000000"/>
+                <w:top w:val="none" w:sz="0" w:space="0" w:color="000000"/>
+                <w:left w:val="none" w:sz="0" w:space="0" w:color="000000"/>
+                <w:right w:val="none" w:sz="0" w:space="0" w:color="000000"/>
+              </w:pBdr>
+              <w:spacing w:after="100" w:before="100" w:line="240"/>
+              <w:ind w:left="100" w:right="100" w:firstLine="0" w:firstLineChars="0"/>
+            </w:pPr>
+            <w:r>
+              <w:rPr>
+                <w:rFonts w:ascii="Helvetica" w:hAnsi="Helvetica" w:eastAsia="Helvetica" w:cs="Helvetica"/>
+                <w:i w:val="false"/>
+                <w:b w:val="false"/>
+                <w:u w:val="none"/>
+                <w:sz w:val="22"/>
+                <w:szCs w:val="22"/>
+                <w:color w:val="000000"/>
+              </w:rPr>
               <w:t xml:space="preserve">MAD</w:t>
+            </w:r>
+          </w:p>
+        </w:tc>
+        <w:tc>
+          <w:tcPr>
+            <w:tcBorders>
+              <w:bottom w:val="single" w:sz="12" w:space="0" w:color="666666"/>
+              <w:top w:val="single" w:sz="12" w:space="0" w:color="666666"/>
+              <w:left w:val="none" w:sz="0" w:space="0" w:color="000000"/>
+              <w:right w:val="none" w:sz="0" w:space="0" w:color="000000"/>
+            </w:tcBorders>
+            <w:shd w:val="clear" w:color="auto" w:fill="FFFFFF"/>
+            <w:tcMar>
+              <w:top w:w="0" w:type="dxa"/>
+              <w:bottom w:w="0" w:type="dxa"/>
+              <w:left w:w="0" w:type="dxa"/>
+              <w:right w:w="0" w:type="dxa"/>
+            </w:tcMar>
+            <w:vAlign w:val="center"/>
+          </w:tcPr>
+          <w:p>
+            <w:pPr>
+              <w:pStyle w:val="Normal"/>
+              <w:jc w:val="right"/>
+              <w:pBdr>
+                <w:bottom w:val="none" w:sz="0" w:space="0" w:color="000000"/>
+                <w:top w:val="none" w:sz="0" w:space="0" w:color="000000"/>
+                <w:left w:val="none" w:sz="0" w:space="0" w:color="000000"/>
+                <w:right w:val="none" w:sz="0" w:space="0" w:color="000000"/>
+              </w:pBdr>
+              <w:spacing w:after="100" w:before="100" w:line="240"/>
+              <w:ind w:left="100" w:right="100" w:firstLine="0" w:firstLineChars="0"/>
+            </w:pPr>
+            <w:r>
+              <w:rPr>
+                <w:rFonts w:ascii="Helvetica" w:hAnsi="Helvetica" w:eastAsia="Helvetica" w:cs="Helvetica"/>
+                <w:i w:val="false"/>
+                <w:b w:val="false"/>
+                <w:u w:val="none"/>
+                <w:sz w:val="22"/>
+                <w:szCs w:val="22"/>
+                <w:color w:val="000000"/>
+              </w:rPr>
+              <w:t xml:space="preserve">MRSD</w:t>
             </w:r>
           </w:p>
         </w:tc>
@@ -625,6 +760,94 @@
                 <w:szCs w:val="22"/>
                 <w:color w:val="000000"/>
               </w:rPr>
+              <w:t xml:space="preserve">0.094</w:t>
+            </w:r>
+          </w:p>
+        </w:tc>
+        <w:tc>
+          <w:tcPr>
+            <w:tcBorders>
+              <w:bottom w:val="none" w:sz="0" w:space="0" w:color="000000"/>
+              <w:top w:val="single" w:sz="12" w:space="0" w:color="666666"/>
+              <w:left w:val="none" w:sz="0" w:space="0" w:color="000000"/>
+              <w:right w:val="none" w:sz="0" w:space="0" w:color="000000"/>
+            </w:tcBorders>
+            <w:shd w:val="clear" w:color="auto" w:fill="FFFFFF"/>
+            <w:tcMar>
+              <w:top w:w="0" w:type="dxa"/>
+              <w:bottom w:w="0" w:type="dxa"/>
+              <w:left w:w="0" w:type="dxa"/>
+              <w:right w:w="0" w:type="dxa"/>
+            </w:tcMar>
+            <w:vAlign w:val="center"/>
+          </w:tcPr>
+          <w:p>
+            <w:pPr>
+              <w:pStyle w:val="Normal"/>
+              <w:jc w:val="right"/>
+              <w:pBdr>
+                <w:bottom w:val="none" w:sz="0" w:space="0" w:color="000000"/>
+                <w:top w:val="none" w:sz="0" w:space="0" w:color="000000"/>
+                <w:left w:val="none" w:sz="0" w:space="0" w:color="000000"/>
+                <w:right w:val="none" w:sz="0" w:space="0" w:color="000000"/>
+              </w:pBdr>
+              <w:spacing w:after="100" w:before="100" w:line="240"/>
+              <w:ind w:left="100" w:right="100" w:firstLine="0" w:firstLineChars="0"/>
+            </w:pPr>
+            <w:r>
+              <w:rPr>
+                <w:rFonts w:ascii="Helvetica" w:hAnsi="Helvetica" w:eastAsia="Helvetica" w:cs="Helvetica"/>
+                <w:i w:val="false"/>
+                <w:b w:val="false"/>
+                <w:u w:val="none"/>
+                <w:sz w:val="22"/>
+                <w:szCs w:val="22"/>
+                <w:color w:val="000000"/>
+              </w:rPr>
+              <w:t xml:space="preserve">0.050</w:t>
+            </w:r>
+          </w:p>
+        </w:tc>
+        <w:tc>
+          <w:tcPr>
+            <w:tcBorders>
+              <w:bottom w:val="none" w:sz="0" w:space="0" w:color="000000"/>
+              <w:top w:val="single" w:sz="12" w:space="0" w:color="666666"/>
+              <w:left w:val="none" w:sz="0" w:space="0" w:color="000000"/>
+              <w:right w:val="none" w:sz="0" w:space="0" w:color="000000"/>
+            </w:tcBorders>
+            <w:shd w:val="clear" w:color="auto" w:fill="FFFFFF"/>
+            <w:tcMar>
+              <w:top w:w="0" w:type="dxa"/>
+              <w:bottom w:w="0" w:type="dxa"/>
+              <w:left w:w="0" w:type="dxa"/>
+              <w:right w:w="0" w:type="dxa"/>
+            </w:tcMar>
+            <w:vAlign w:val="center"/>
+          </w:tcPr>
+          <w:p>
+            <w:pPr>
+              <w:pStyle w:val="Normal"/>
+              <w:jc w:val="right"/>
+              <w:pBdr>
+                <w:bottom w:val="none" w:sz="0" w:space="0" w:color="000000"/>
+                <w:top w:val="none" w:sz="0" w:space="0" w:color="000000"/>
+                <w:left w:val="none" w:sz="0" w:space="0" w:color="000000"/>
+                <w:right w:val="none" w:sz="0" w:space="0" w:color="000000"/>
+              </w:pBdr>
+              <w:spacing w:after="100" w:before="100" w:line="240"/>
+              <w:ind w:left="100" w:right="100" w:firstLine="0" w:firstLineChars="0"/>
+            </w:pPr>
+            <w:r>
+              <w:rPr>
+                <w:rFonts w:ascii="Helvetica" w:hAnsi="Helvetica" w:eastAsia="Helvetica" w:cs="Helvetica"/>
+                <w:i w:val="false"/>
+                <w:b w:val="false"/>
+                <w:u w:val="none"/>
+                <w:sz w:val="22"/>
+                <w:szCs w:val="22"/>
+                <w:color w:val="000000"/>
+              </w:rPr>
               <w:t xml:space="preserve">72</w:t>
             </w:r>
           </w:p>
@@ -846,6 +1069,50 @@
                 <w:color w:val="000000"/>
               </w:rPr>
               <w:t xml:space="preserve">0.325</w:t>
+            </w:r>
+          </w:p>
+        </w:tc>
+        <w:tc>
+          <w:tcPr>
+            <w:tcBorders>
+              <w:bottom w:val="none" w:sz="0" w:space="0" w:color="000000"/>
+              <w:top w:val="single" w:sz="12" w:space="0" w:color="666666"/>
+              <w:left w:val="none" w:sz="0" w:space="0" w:color="000000"/>
+              <w:right w:val="none" w:sz="0" w:space="0" w:color="000000"/>
+            </w:tcBorders>
+            <w:shd w:val="clear" w:color="auto" w:fill="FFFFFF"/>
+            <w:tcMar>
+              <w:top w:w="0" w:type="dxa"/>
+              <w:bottom w:w="0" w:type="dxa"/>
+              <w:left w:w="0" w:type="dxa"/>
+              <w:right w:w="0" w:type="dxa"/>
+            </w:tcMar>
+            <w:vAlign w:val="center"/>
+          </w:tcPr>
+          <w:p>
+            <w:pPr>
+              <w:pStyle w:val="Normal"/>
+              <w:jc w:val="right"/>
+              <w:pBdr>
+                <w:bottom w:val="none" w:sz="0" w:space="0" w:color="000000"/>
+                <w:top w:val="none" w:sz="0" w:space="0" w:color="000000"/>
+                <w:left w:val="none" w:sz="0" w:space="0" w:color="000000"/>
+                <w:right w:val="none" w:sz="0" w:space="0" w:color="000000"/>
+              </w:pBdr>
+              <w:spacing w:after="100" w:before="100" w:line="240"/>
+              <w:ind w:left="100" w:right="100" w:firstLine="0" w:firstLineChars="0"/>
+            </w:pPr>
+            <w:r>
+              <w:rPr>
+                <w:rFonts w:ascii="Helvetica" w:hAnsi="Helvetica" w:eastAsia="Helvetica" w:cs="Helvetica"/>
+                <w:i w:val="false"/>
+                <w:b w:val="false"/>
+                <w:u w:val="none"/>
+                <w:sz w:val="22"/>
+                <w:szCs w:val="22"/>
+                <w:color w:val="000000"/>
+              </w:rPr>
+              <w:t xml:space="preserve">-12.004</w:t>
             </w:r>
           </w:p>
         </w:tc>
@@ -1027,6 +1294,94 @@
                 <w:szCs w:val="22"/>
                 <w:color w:val="000000"/>
               </w:rPr>
+              <w:t xml:space="preserve"/>
+            </w:r>
+          </w:p>
+        </w:tc>
+        <w:tc>
+          <w:tcPr>
+            <w:tcBorders>
+              <w:bottom w:val="none" w:sz="0" w:space="0" w:color="000000"/>
+              <w:top w:val="none" w:sz="0" w:space="0" w:color="000000"/>
+              <w:left w:val="none" w:sz="0" w:space="0" w:color="000000"/>
+              <w:right w:val="none" w:sz="0" w:space="0" w:color="000000"/>
+            </w:tcBorders>
+            <w:shd w:val="clear" w:color="auto" w:fill="FFFFFF"/>
+            <w:tcMar>
+              <w:top w:w="0" w:type="dxa"/>
+              <w:bottom w:w="0" w:type="dxa"/>
+              <w:left w:w="0" w:type="dxa"/>
+              <w:right w:w="0" w:type="dxa"/>
+            </w:tcMar>
+            <w:vAlign w:val="center"/>
+          </w:tcPr>
+          <w:p>
+            <w:pPr>
+              <w:pStyle w:val="Normal"/>
+              <w:jc w:val="right"/>
+              <w:pBdr>
+                <w:bottom w:val="none" w:sz="0" w:space="0" w:color="000000"/>
+                <w:top w:val="none" w:sz="0" w:space="0" w:color="000000"/>
+                <w:left w:val="none" w:sz="0" w:space="0" w:color="000000"/>
+                <w:right w:val="none" w:sz="0" w:space="0" w:color="000000"/>
+              </w:pBdr>
+              <w:spacing w:after="100" w:before="100" w:line="240"/>
+              <w:ind w:left="100" w:right="100" w:firstLine="0" w:firstLineChars="0"/>
+            </w:pPr>
+            <w:r>
+              <w:rPr>
+                <w:rFonts w:ascii="Helvetica" w:hAnsi="Helvetica" w:eastAsia="Helvetica" w:cs="Helvetica"/>
+                <w:i w:val="false"/>
+                <w:b w:val="false"/>
+                <w:u w:val="none"/>
+                <w:sz w:val="22"/>
+                <w:szCs w:val="22"/>
+                <w:color w:val="000000"/>
+              </w:rPr>
+              <w:t xml:space="preserve"/>
+            </w:r>
+          </w:p>
+        </w:tc>
+        <w:tc>
+          <w:tcPr>
+            <w:tcBorders>
+              <w:bottom w:val="none" w:sz="0" w:space="0" w:color="000000"/>
+              <w:top w:val="none" w:sz="0" w:space="0" w:color="000000"/>
+              <w:left w:val="none" w:sz="0" w:space="0" w:color="000000"/>
+              <w:right w:val="none" w:sz="0" w:space="0" w:color="000000"/>
+            </w:tcBorders>
+            <w:shd w:val="clear" w:color="auto" w:fill="FFFFFF"/>
+            <w:tcMar>
+              <w:top w:w="0" w:type="dxa"/>
+              <w:bottom w:w="0" w:type="dxa"/>
+              <w:left w:w="0" w:type="dxa"/>
+              <w:right w:w="0" w:type="dxa"/>
+            </w:tcMar>
+            <w:vAlign w:val="center"/>
+          </w:tcPr>
+          <w:p>
+            <w:pPr>
+              <w:pStyle w:val="Normal"/>
+              <w:jc w:val="right"/>
+              <w:pBdr>
+                <w:bottom w:val="none" w:sz="0" w:space="0" w:color="000000"/>
+                <w:top w:val="none" w:sz="0" w:space="0" w:color="000000"/>
+                <w:left w:val="none" w:sz="0" w:space="0" w:color="000000"/>
+                <w:right w:val="none" w:sz="0" w:space="0" w:color="000000"/>
+              </w:pBdr>
+              <w:spacing w:after="100" w:before="100" w:line="240"/>
+              <w:ind w:left="100" w:right="100" w:firstLine="0" w:firstLineChars="0"/>
+            </w:pPr>
+            <w:r>
+              <w:rPr>
+                <w:rFonts w:ascii="Helvetica" w:hAnsi="Helvetica" w:eastAsia="Helvetica" w:cs="Helvetica"/>
+                <w:i w:val="false"/>
+                <w:b w:val="false"/>
+                <w:u w:val="none"/>
+                <w:sz w:val="22"/>
+                <w:szCs w:val="22"/>
+                <w:color w:val="000000"/>
+              </w:rPr>
               <w:t xml:space="preserve">72</w:t>
             </w:r>
           </w:p>
@@ -1248,6 +1603,50 @@
                 <w:color w:val="000000"/>
               </w:rPr>
               <w:t xml:space="preserve">0.478</w:t>
+            </w:r>
+          </w:p>
+        </w:tc>
+        <w:tc>
+          <w:tcPr>
+            <w:tcBorders>
+              <w:bottom w:val="none" w:sz="0" w:space="0" w:color="000000"/>
+              <w:top w:val="none" w:sz="0" w:space="0" w:color="000000"/>
+              <w:left w:val="none" w:sz="0" w:space="0" w:color="000000"/>
+              <w:right w:val="none" w:sz="0" w:space="0" w:color="000000"/>
+            </w:tcBorders>
+            <w:shd w:val="clear" w:color="auto" w:fill="FFFFFF"/>
+            <w:tcMar>
+              <w:top w:w="0" w:type="dxa"/>
+              <w:bottom w:w="0" w:type="dxa"/>
+              <w:left w:w="0" w:type="dxa"/>
+              <w:right w:w="0" w:type="dxa"/>
+            </w:tcMar>
+            <w:vAlign w:val="center"/>
+          </w:tcPr>
+          <w:p>
+            <w:pPr>
+              <w:pStyle w:val="Normal"/>
+              <w:jc w:val="right"/>
+              <w:pBdr>
+                <w:bottom w:val="none" w:sz="0" w:space="0" w:color="000000"/>
+                <w:top w:val="none" w:sz="0" w:space="0" w:color="000000"/>
+                <w:left w:val="none" w:sz="0" w:space="0" w:color="000000"/>
+                <w:right w:val="none" w:sz="0" w:space="0" w:color="000000"/>
+              </w:pBdr>
+              <w:spacing w:after="100" w:before="100" w:line="240"/>
+              <w:ind w:left="100" w:right="100" w:firstLine="0" w:firstLineChars="0"/>
+            </w:pPr>
+            <w:r>
+              <w:rPr>
+                <w:rFonts w:ascii="Helvetica" w:hAnsi="Helvetica" w:eastAsia="Helvetica" w:cs="Helvetica"/>
+                <w:i w:val="false"/>
+                <w:b w:val="false"/>
+                <w:u w:val="none"/>
+                <w:sz w:val="22"/>
+                <w:szCs w:val="22"/>
+                <w:color w:val="000000"/>
+              </w:rPr>
+              <w:t xml:space="preserve">16.593</w:t>
             </w:r>
           </w:p>
         </w:tc>
@@ -1429,6 +1828,94 @@
                 <w:szCs w:val="22"/>
                 <w:color w:val="000000"/>
               </w:rPr>
+              <w:t xml:space="preserve">0.445</w:t>
+            </w:r>
+          </w:p>
+        </w:tc>
+        <w:tc>
+          <w:tcPr>
+            <w:tcBorders>
+              <w:bottom w:val="none" w:sz="0" w:space="0" w:color="000000"/>
+              <w:top w:val="none" w:sz="0" w:space="0" w:color="000000"/>
+              <w:left w:val="none" w:sz="0" w:space="0" w:color="000000"/>
+              <w:right w:val="none" w:sz="0" w:space="0" w:color="000000"/>
+            </w:tcBorders>
+            <w:shd w:val="clear" w:color="auto" w:fill="FFFFFF"/>
+            <w:tcMar>
+              <w:top w:w="0" w:type="dxa"/>
+              <w:bottom w:w="0" w:type="dxa"/>
+              <w:left w:w="0" w:type="dxa"/>
+              <w:right w:w="0" w:type="dxa"/>
+            </w:tcMar>
+            <w:vAlign w:val="center"/>
+          </w:tcPr>
+          <w:p>
+            <w:pPr>
+              <w:pStyle w:val="Normal"/>
+              <w:jc w:val="right"/>
+              <w:pBdr>
+                <w:bottom w:val="none" w:sz="0" w:space="0" w:color="000000"/>
+                <w:top w:val="none" w:sz="0" w:space="0" w:color="000000"/>
+                <w:left w:val="none" w:sz="0" w:space="0" w:color="000000"/>
+                <w:right w:val="none" w:sz="0" w:space="0" w:color="000000"/>
+              </w:pBdr>
+              <w:spacing w:after="100" w:before="100" w:line="240"/>
+              <w:ind w:left="100" w:right="100" w:firstLine="0" w:firstLineChars="0"/>
+            </w:pPr>
+            <w:r>
+              <w:rPr>
+                <w:rFonts w:ascii="Helvetica" w:hAnsi="Helvetica" w:eastAsia="Helvetica" w:cs="Helvetica"/>
+                <w:i w:val="false"/>
+                <w:b w:val="false"/>
+                <w:u w:val="none"/>
+                <w:sz w:val="22"/>
+                <w:szCs w:val="22"/>
+                <w:color w:val="000000"/>
+              </w:rPr>
+              <w:t xml:space="preserve">0.117</w:t>
+            </w:r>
+          </w:p>
+        </w:tc>
+        <w:tc>
+          <w:tcPr>
+            <w:tcBorders>
+              <w:bottom w:val="none" w:sz="0" w:space="0" w:color="000000"/>
+              <w:top w:val="none" w:sz="0" w:space="0" w:color="000000"/>
+              <w:left w:val="none" w:sz="0" w:space="0" w:color="000000"/>
+              <w:right w:val="none" w:sz="0" w:space="0" w:color="000000"/>
+            </w:tcBorders>
+            <w:shd w:val="clear" w:color="auto" w:fill="FFFFFF"/>
+            <w:tcMar>
+              <w:top w:w="0" w:type="dxa"/>
+              <w:bottom w:w="0" w:type="dxa"/>
+              <w:left w:w="0" w:type="dxa"/>
+              <w:right w:w="0" w:type="dxa"/>
+            </w:tcMar>
+            <w:vAlign w:val="center"/>
+          </w:tcPr>
+          <w:p>
+            <w:pPr>
+              <w:pStyle w:val="Normal"/>
+              <w:jc w:val="right"/>
+              <w:pBdr>
+                <w:bottom w:val="none" w:sz="0" w:space="0" w:color="000000"/>
+                <w:top w:val="none" w:sz="0" w:space="0" w:color="000000"/>
+                <w:left w:val="none" w:sz="0" w:space="0" w:color="000000"/>
+                <w:right w:val="none" w:sz="0" w:space="0" w:color="000000"/>
+              </w:pBdr>
+              <w:spacing w:after="100" w:before="100" w:line="240"/>
+              <w:ind w:left="100" w:right="100" w:firstLine="0" w:firstLineChars="0"/>
+            </w:pPr>
+            <w:r>
+              <w:rPr>
+                <w:rFonts w:ascii="Helvetica" w:hAnsi="Helvetica" w:eastAsia="Helvetica" w:cs="Helvetica"/>
+                <w:i w:val="false"/>
+                <w:b w:val="false"/>
+                <w:u w:val="none"/>
+                <w:sz w:val="22"/>
+                <w:szCs w:val="22"/>
+                <w:color w:val="000000"/>
+              </w:rPr>
               <w:t xml:space="preserve">72</w:t>
             </w:r>
           </w:p>
@@ -1650,6 +2137,50 @@
                 <w:color w:val="000000"/>
               </w:rPr>
               <w:t xml:space="preserve">0.811</w:t>
+            </w:r>
+          </w:p>
+        </w:tc>
+        <w:tc>
+          <w:tcPr>
+            <w:tcBorders>
+              <w:bottom w:val="none" w:sz="0" w:space="0" w:color="000000"/>
+              <w:top w:val="none" w:sz="0" w:space="0" w:color="000000"/>
+              <w:left w:val="none" w:sz="0" w:space="0" w:color="000000"/>
+              <w:right w:val="none" w:sz="0" w:space="0" w:color="000000"/>
+            </w:tcBorders>
+            <w:shd w:val="clear" w:color="auto" w:fill="FFFFFF"/>
+            <w:tcMar>
+              <w:top w:w="0" w:type="dxa"/>
+              <w:bottom w:w="0" w:type="dxa"/>
+              <w:left w:w="0" w:type="dxa"/>
+              <w:right w:w="0" w:type="dxa"/>
+            </w:tcMar>
+            <w:vAlign w:val="center"/>
+          </w:tcPr>
+          <w:p>
+            <w:pPr>
+              <w:pStyle w:val="Normal"/>
+              <w:jc w:val="right"/>
+              <w:pBdr>
+                <w:bottom w:val="none" w:sz="0" w:space="0" w:color="000000"/>
+                <w:top w:val="none" w:sz="0" w:space="0" w:color="000000"/>
+                <w:left w:val="none" w:sz="0" w:space="0" w:color="000000"/>
+                <w:right w:val="none" w:sz="0" w:space="0" w:color="000000"/>
+              </w:pBdr>
+              <w:spacing w:after="100" w:before="100" w:line="240"/>
+              <w:ind w:left="100" w:right="100" w:firstLine="0" w:firstLineChars="0"/>
+            </w:pPr>
+            <w:r>
+              <w:rPr>
+                <w:rFonts w:ascii="Helvetica" w:hAnsi="Helvetica" w:eastAsia="Helvetica" w:cs="Helvetica"/>
+                <w:i w:val="false"/>
+                <w:b w:val="false"/>
+                <w:u w:val="none"/>
+                <w:sz w:val="22"/>
+                <w:szCs w:val="22"/>
+                <w:color w:val="000000"/>
+              </w:rPr>
+              <w:t xml:space="preserve">3.104</w:t>
             </w:r>
           </w:p>
         </w:tc>
@@ -1831,6 +2362,94 @@
                 <w:szCs w:val="22"/>
                 <w:color w:val="000000"/>
               </w:rPr>
+              <w:t xml:space="preserve">-0.079</w:t>
+            </w:r>
+          </w:p>
+        </w:tc>
+        <w:tc>
+          <w:tcPr>
+            <w:tcBorders>
+              <w:bottom w:val="none" w:sz="0" w:space="0" w:color="000000"/>
+              <w:top w:val="none" w:sz="0" w:space="0" w:color="000000"/>
+              <w:left w:val="none" w:sz="0" w:space="0" w:color="000000"/>
+              <w:right w:val="none" w:sz="0" w:space="0" w:color="000000"/>
+            </w:tcBorders>
+            <w:shd w:val="clear" w:color="auto" w:fill="FFFFFF"/>
+            <w:tcMar>
+              <w:top w:w="0" w:type="dxa"/>
+              <w:bottom w:w="0" w:type="dxa"/>
+              <w:left w:w="0" w:type="dxa"/>
+              <w:right w:w="0" w:type="dxa"/>
+            </w:tcMar>
+            <w:vAlign w:val="center"/>
+          </w:tcPr>
+          <w:p>
+            <w:pPr>
+              <w:pStyle w:val="Normal"/>
+              <w:jc w:val="right"/>
+              <w:pBdr>
+                <w:bottom w:val="none" w:sz="0" w:space="0" w:color="000000"/>
+                <w:top w:val="none" w:sz="0" w:space="0" w:color="000000"/>
+                <w:left w:val="none" w:sz="0" w:space="0" w:color="000000"/>
+                <w:right w:val="none" w:sz="0" w:space="0" w:color="000000"/>
+              </w:pBdr>
+              <w:spacing w:after="100" w:before="100" w:line="240"/>
+              <w:ind w:left="100" w:right="100" w:firstLine="0" w:firstLineChars="0"/>
+            </w:pPr>
+            <w:r>
+              <w:rPr>
+                <w:rFonts w:ascii="Helvetica" w:hAnsi="Helvetica" w:eastAsia="Helvetica" w:cs="Helvetica"/>
+                <w:i w:val="false"/>
+                <w:b w:val="false"/>
+                <w:u w:val="none"/>
+                <w:sz w:val="22"/>
+                <w:szCs w:val="22"/>
+                <w:color w:val="000000"/>
+              </w:rPr>
+              <w:t xml:space="preserve">0.052</w:t>
+            </w:r>
+          </w:p>
+        </w:tc>
+        <w:tc>
+          <w:tcPr>
+            <w:tcBorders>
+              <w:bottom w:val="none" w:sz="0" w:space="0" w:color="000000"/>
+              <w:top w:val="none" w:sz="0" w:space="0" w:color="000000"/>
+              <w:left w:val="none" w:sz="0" w:space="0" w:color="000000"/>
+              <w:right w:val="none" w:sz="0" w:space="0" w:color="000000"/>
+            </w:tcBorders>
+            <w:shd w:val="clear" w:color="auto" w:fill="FFFFFF"/>
+            <w:tcMar>
+              <w:top w:w="0" w:type="dxa"/>
+              <w:bottom w:w="0" w:type="dxa"/>
+              <w:left w:w="0" w:type="dxa"/>
+              <w:right w:w="0" w:type="dxa"/>
+            </w:tcMar>
+            <w:vAlign w:val="center"/>
+          </w:tcPr>
+          <w:p>
+            <w:pPr>
+              <w:pStyle w:val="Normal"/>
+              <w:jc w:val="right"/>
+              <w:pBdr>
+                <w:bottom w:val="none" w:sz="0" w:space="0" w:color="000000"/>
+                <w:top w:val="none" w:sz="0" w:space="0" w:color="000000"/>
+                <w:left w:val="none" w:sz="0" w:space="0" w:color="000000"/>
+                <w:right w:val="none" w:sz="0" w:space="0" w:color="000000"/>
+              </w:pBdr>
+              <w:spacing w:after="100" w:before="100" w:line="240"/>
+              <w:ind w:left="100" w:right="100" w:firstLine="0" w:firstLineChars="0"/>
+            </w:pPr>
+            <w:r>
+              <w:rPr>
+                <w:rFonts w:ascii="Helvetica" w:hAnsi="Helvetica" w:eastAsia="Helvetica" w:cs="Helvetica"/>
+                <w:i w:val="false"/>
+                <w:b w:val="false"/>
+                <w:u w:val="none"/>
+                <w:sz w:val="22"/>
+                <w:szCs w:val="22"/>
+                <w:color w:val="000000"/>
+              </w:rPr>
               <w:t xml:space="preserve">72</w:t>
             </w:r>
           </w:p>
@@ -2052,6 +2671,50 @@
                 <w:color w:val="000000"/>
               </w:rPr>
               <w:t xml:space="preserve">0.349</w:t>
+            </w:r>
+          </w:p>
+        </w:tc>
+        <w:tc>
+          <w:tcPr>
+            <w:tcBorders>
+              <w:bottom w:val="none" w:sz="0" w:space="0" w:color="000000"/>
+              <w:top w:val="none" w:sz="0" w:space="0" w:color="000000"/>
+              <w:left w:val="none" w:sz="0" w:space="0" w:color="000000"/>
+              <w:right w:val="none" w:sz="0" w:space="0" w:color="000000"/>
+            </w:tcBorders>
+            <w:shd w:val="clear" w:color="auto" w:fill="FFFFFF"/>
+            <w:tcMar>
+              <w:top w:w="0" w:type="dxa"/>
+              <w:bottom w:w="0" w:type="dxa"/>
+              <w:left w:w="0" w:type="dxa"/>
+              <w:right w:w="0" w:type="dxa"/>
+            </w:tcMar>
+            <w:vAlign w:val="center"/>
+          </w:tcPr>
+          <w:p>
+            <w:pPr>
+              <w:pStyle w:val="Normal"/>
+              <w:jc w:val="right"/>
+              <w:pBdr>
+                <w:bottom w:val="none" w:sz="0" w:space="0" w:color="000000"/>
+                <w:top w:val="none" w:sz="0" w:space="0" w:color="000000"/>
+                <w:left w:val="none" w:sz="0" w:space="0" w:color="000000"/>
+                <w:right w:val="none" w:sz="0" w:space="0" w:color="000000"/>
+              </w:pBdr>
+              <w:spacing w:after="100" w:before="100" w:line="240"/>
+              <w:ind w:left="100" w:right="100" w:firstLine="0" w:firstLineChars="0"/>
+            </w:pPr>
+            <w:r>
+              <w:rPr>
+                <w:rFonts w:ascii="Helvetica" w:hAnsi="Helvetica" w:eastAsia="Helvetica" w:cs="Helvetica"/>
+                <w:i w:val="false"/>
+                <w:b w:val="false"/>
+                <w:u w:val="none"/>
+                <w:sz w:val="22"/>
+                <w:szCs w:val="22"/>
+                <w:color w:val="000000"/>
+              </w:rPr>
+              <w:t xml:space="preserve">22.693</w:t>
             </w:r>
           </w:p>
         </w:tc>
@@ -2233,6 +2896,94 @@
                 <w:szCs w:val="22"/>
                 <w:color w:val="000000"/>
               </w:rPr>
+              <w:t xml:space="preserve"/>
+            </w:r>
+          </w:p>
+        </w:tc>
+        <w:tc>
+          <w:tcPr>
+            <w:tcBorders>
+              <w:bottom w:val="none" w:sz="0" w:space="0" w:color="000000"/>
+              <w:top w:val="none" w:sz="0" w:space="0" w:color="000000"/>
+              <w:left w:val="none" w:sz="0" w:space="0" w:color="000000"/>
+              <w:right w:val="none" w:sz="0" w:space="0" w:color="000000"/>
+            </w:tcBorders>
+            <w:shd w:val="clear" w:color="auto" w:fill="FFFFFF"/>
+            <w:tcMar>
+              <w:top w:w="0" w:type="dxa"/>
+              <w:bottom w:w="0" w:type="dxa"/>
+              <w:left w:w="0" w:type="dxa"/>
+              <w:right w:w="0" w:type="dxa"/>
+            </w:tcMar>
+            <w:vAlign w:val="center"/>
+          </w:tcPr>
+          <w:p>
+            <w:pPr>
+              <w:pStyle w:val="Normal"/>
+              <w:jc w:val="right"/>
+              <w:pBdr>
+                <w:bottom w:val="none" w:sz="0" w:space="0" w:color="000000"/>
+                <w:top w:val="none" w:sz="0" w:space="0" w:color="000000"/>
+                <w:left w:val="none" w:sz="0" w:space="0" w:color="000000"/>
+                <w:right w:val="none" w:sz="0" w:space="0" w:color="000000"/>
+              </w:pBdr>
+              <w:spacing w:after="100" w:before="100" w:line="240"/>
+              <w:ind w:left="100" w:right="100" w:firstLine="0" w:firstLineChars="0"/>
+            </w:pPr>
+            <w:r>
+              <w:rPr>
+                <w:rFonts w:ascii="Helvetica" w:hAnsi="Helvetica" w:eastAsia="Helvetica" w:cs="Helvetica"/>
+                <w:i w:val="false"/>
+                <w:b w:val="false"/>
+                <w:u w:val="none"/>
+                <w:sz w:val="22"/>
+                <w:szCs w:val="22"/>
+                <w:color w:val="000000"/>
+              </w:rPr>
+              <w:t xml:space="preserve"/>
+            </w:r>
+          </w:p>
+        </w:tc>
+        <w:tc>
+          <w:tcPr>
+            <w:tcBorders>
+              <w:bottom w:val="none" w:sz="0" w:space="0" w:color="000000"/>
+              <w:top w:val="none" w:sz="0" w:space="0" w:color="000000"/>
+              <w:left w:val="none" w:sz="0" w:space="0" w:color="000000"/>
+              <w:right w:val="none" w:sz="0" w:space="0" w:color="000000"/>
+            </w:tcBorders>
+            <w:shd w:val="clear" w:color="auto" w:fill="FFFFFF"/>
+            <w:tcMar>
+              <w:top w:w="0" w:type="dxa"/>
+              <w:bottom w:w="0" w:type="dxa"/>
+              <w:left w:w="0" w:type="dxa"/>
+              <w:right w:w="0" w:type="dxa"/>
+            </w:tcMar>
+            <w:vAlign w:val="center"/>
+          </w:tcPr>
+          <w:p>
+            <w:pPr>
+              <w:pStyle w:val="Normal"/>
+              <w:jc w:val="right"/>
+              <w:pBdr>
+                <w:bottom w:val="none" w:sz="0" w:space="0" w:color="000000"/>
+                <w:top w:val="none" w:sz="0" w:space="0" w:color="000000"/>
+                <w:left w:val="none" w:sz="0" w:space="0" w:color="000000"/>
+                <w:right w:val="none" w:sz="0" w:space="0" w:color="000000"/>
+              </w:pBdr>
+              <w:spacing w:after="100" w:before="100" w:line="240"/>
+              <w:ind w:left="100" w:right="100" w:firstLine="0" w:firstLineChars="0"/>
+            </w:pPr>
+            <w:r>
+              <w:rPr>
+                <w:rFonts w:ascii="Helvetica" w:hAnsi="Helvetica" w:eastAsia="Helvetica" w:cs="Helvetica"/>
+                <w:i w:val="false"/>
+                <w:b w:val="false"/>
+                <w:u w:val="none"/>
+                <w:sz w:val="22"/>
+                <w:szCs w:val="22"/>
+                <w:color w:val="000000"/>
+              </w:rPr>
               <w:t xml:space="preserve">72</w:t>
             </w:r>
           </w:p>
@@ -2454,6 +3205,50 @@
                 <w:color w:val="000000"/>
               </w:rPr>
               <w:t xml:space="preserve">0.748</w:t>
+            </w:r>
+          </w:p>
+        </w:tc>
+        <w:tc>
+          <w:tcPr>
+            <w:tcBorders>
+              <w:bottom w:val="none" w:sz="0" w:space="0" w:color="000000"/>
+              <w:top w:val="none" w:sz="0" w:space="0" w:color="000000"/>
+              <w:left w:val="none" w:sz="0" w:space="0" w:color="000000"/>
+              <w:right w:val="none" w:sz="0" w:space="0" w:color="000000"/>
+            </w:tcBorders>
+            <w:shd w:val="clear" w:color="auto" w:fill="FFFFFF"/>
+            <w:tcMar>
+              <w:top w:w="0" w:type="dxa"/>
+              <w:bottom w:w="0" w:type="dxa"/>
+              <w:left w:w="0" w:type="dxa"/>
+              <w:right w:w="0" w:type="dxa"/>
+            </w:tcMar>
+            <w:vAlign w:val="center"/>
+          </w:tcPr>
+          <w:p>
+            <w:pPr>
+              <w:pStyle w:val="Normal"/>
+              <w:jc w:val="right"/>
+              <w:pBdr>
+                <w:bottom w:val="none" w:sz="0" w:space="0" w:color="000000"/>
+                <w:top w:val="none" w:sz="0" w:space="0" w:color="000000"/>
+                <w:left w:val="none" w:sz="0" w:space="0" w:color="000000"/>
+                <w:right w:val="none" w:sz="0" w:space="0" w:color="000000"/>
+              </w:pBdr>
+              <w:spacing w:after="100" w:before="100" w:line="240"/>
+              <w:ind w:left="100" w:right="100" w:firstLine="0" w:firstLineChars="0"/>
+            </w:pPr>
+            <w:r>
+              <w:rPr>
+                <w:rFonts w:ascii="Helvetica" w:hAnsi="Helvetica" w:eastAsia="Helvetica" w:cs="Helvetica"/>
+                <w:i w:val="false"/>
+                <w:b w:val="false"/>
+                <w:u w:val="none"/>
+                <w:sz w:val="22"/>
+                <w:szCs w:val="22"/>
+                <w:color w:val="000000"/>
+              </w:rPr>
+              <w:t xml:space="preserve">55.335</w:t>
             </w:r>
           </w:p>
         </w:tc>
@@ -2635,6 +3430,94 @@
                 <w:szCs w:val="22"/>
                 <w:color w:val="000000"/>
               </w:rPr>
+              <w:t xml:space="preserve"/>
+            </w:r>
+          </w:p>
+        </w:tc>
+        <w:tc>
+          <w:tcPr>
+            <w:tcBorders>
+              <w:bottom w:val="none" w:sz="0" w:space="0" w:color="000000"/>
+              <w:top w:val="none" w:sz="0" w:space="0" w:color="000000"/>
+              <w:left w:val="none" w:sz="0" w:space="0" w:color="000000"/>
+              <w:right w:val="none" w:sz="0" w:space="0" w:color="000000"/>
+            </w:tcBorders>
+            <w:shd w:val="clear" w:color="auto" w:fill="FFFFFF"/>
+            <w:tcMar>
+              <w:top w:w="0" w:type="dxa"/>
+              <w:bottom w:w="0" w:type="dxa"/>
+              <w:left w:w="0" w:type="dxa"/>
+              <w:right w:w="0" w:type="dxa"/>
+            </w:tcMar>
+            <w:vAlign w:val="center"/>
+          </w:tcPr>
+          <w:p>
+            <w:pPr>
+              <w:pStyle w:val="Normal"/>
+              <w:jc w:val="right"/>
+              <w:pBdr>
+                <w:bottom w:val="none" w:sz="0" w:space="0" w:color="000000"/>
+                <w:top w:val="none" w:sz="0" w:space="0" w:color="000000"/>
+                <w:left w:val="none" w:sz="0" w:space="0" w:color="000000"/>
+                <w:right w:val="none" w:sz="0" w:space="0" w:color="000000"/>
+              </w:pBdr>
+              <w:spacing w:after="100" w:before="100" w:line="240"/>
+              <w:ind w:left="100" w:right="100" w:firstLine="0" w:firstLineChars="0"/>
+            </w:pPr>
+            <w:r>
+              <w:rPr>
+                <w:rFonts w:ascii="Helvetica" w:hAnsi="Helvetica" w:eastAsia="Helvetica" w:cs="Helvetica"/>
+                <w:i w:val="false"/>
+                <w:b w:val="false"/>
+                <w:u w:val="none"/>
+                <w:sz w:val="22"/>
+                <w:szCs w:val="22"/>
+                <w:color w:val="000000"/>
+              </w:rPr>
+              <w:t xml:space="preserve"/>
+            </w:r>
+          </w:p>
+        </w:tc>
+        <w:tc>
+          <w:tcPr>
+            <w:tcBorders>
+              <w:bottom w:val="none" w:sz="0" w:space="0" w:color="000000"/>
+              <w:top w:val="none" w:sz="0" w:space="0" w:color="000000"/>
+              <w:left w:val="none" w:sz="0" w:space="0" w:color="000000"/>
+              <w:right w:val="none" w:sz="0" w:space="0" w:color="000000"/>
+            </w:tcBorders>
+            <w:shd w:val="clear" w:color="auto" w:fill="FFFFFF"/>
+            <w:tcMar>
+              <w:top w:w="0" w:type="dxa"/>
+              <w:bottom w:w="0" w:type="dxa"/>
+              <w:left w:w="0" w:type="dxa"/>
+              <w:right w:w="0" w:type="dxa"/>
+            </w:tcMar>
+            <w:vAlign w:val="center"/>
+          </w:tcPr>
+          <w:p>
+            <w:pPr>
+              <w:pStyle w:val="Normal"/>
+              <w:jc w:val="right"/>
+              <w:pBdr>
+                <w:bottom w:val="none" w:sz="0" w:space="0" w:color="000000"/>
+                <w:top w:val="none" w:sz="0" w:space="0" w:color="000000"/>
+                <w:left w:val="none" w:sz="0" w:space="0" w:color="000000"/>
+                <w:right w:val="none" w:sz="0" w:space="0" w:color="000000"/>
+              </w:pBdr>
+              <w:spacing w:after="100" w:before="100" w:line="240"/>
+              <w:ind w:left="100" w:right="100" w:firstLine="0" w:firstLineChars="0"/>
+            </w:pPr>
+            <w:r>
+              <w:rPr>
+                <w:rFonts w:ascii="Helvetica" w:hAnsi="Helvetica" w:eastAsia="Helvetica" w:cs="Helvetica"/>
+                <w:i w:val="false"/>
+                <w:b w:val="false"/>
+                <w:u w:val="none"/>
+                <w:sz w:val="22"/>
+                <w:szCs w:val="22"/>
+                <w:color w:val="000000"/>
+              </w:rPr>
               <w:t xml:space="preserve">72</w:t>
             </w:r>
           </w:p>
@@ -2856,6 +3739,50 @@
                 <w:color w:val="000000"/>
               </w:rPr>
               <w:t xml:space="preserve">1.062</w:t>
+            </w:r>
+          </w:p>
+        </w:tc>
+        <w:tc>
+          <w:tcPr>
+            <w:tcBorders>
+              <w:bottom w:val="none" w:sz="0" w:space="0" w:color="000000"/>
+              <w:top w:val="none" w:sz="0" w:space="0" w:color="000000"/>
+              <w:left w:val="none" w:sz="0" w:space="0" w:color="000000"/>
+              <w:right w:val="none" w:sz="0" w:space="0" w:color="000000"/>
+            </w:tcBorders>
+            <w:shd w:val="clear" w:color="auto" w:fill="FFFFFF"/>
+            <w:tcMar>
+              <w:top w:w="0" w:type="dxa"/>
+              <w:bottom w:w="0" w:type="dxa"/>
+              <w:left w:w="0" w:type="dxa"/>
+              <w:right w:w="0" w:type="dxa"/>
+            </w:tcMar>
+            <w:vAlign w:val="center"/>
+          </w:tcPr>
+          <w:p>
+            <w:pPr>
+              <w:pStyle w:val="Normal"/>
+              <w:jc w:val="right"/>
+              <w:pBdr>
+                <w:bottom w:val="none" w:sz="0" w:space="0" w:color="000000"/>
+                <w:top w:val="none" w:sz="0" w:space="0" w:color="000000"/>
+                <w:left w:val="none" w:sz="0" w:space="0" w:color="000000"/>
+                <w:right w:val="none" w:sz="0" w:space="0" w:color="000000"/>
+              </w:pBdr>
+              <w:spacing w:after="100" w:before="100" w:line="240"/>
+              <w:ind w:left="100" w:right="100" w:firstLine="0" w:firstLineChars="0"/>
+            </w:pPr>
+            <w:r>
+              <w:rPr>
+                <w:rFonts w:ascii="Helvetica" w:hAnsi="Helvetica" w:eastAsia="Helvetica" w:cs="Helvetica"/>
+                <w:i w:val="false"/>
+                <w:b w:val="false"/>
+                <w:u w:val="none"/>
+                <w:sz w:val="22"/>
+                <w:szCs w:val="22"/>
+                <w:color w:val="000000"/>
+              </w:rPr>
+              <w:t xml:space="preserve">3.345</w:t>
             </w:r>
           </w:p>
         </w:tc>
@@ -3037,6 +3964,94 @@
                 <w:szCs w:val="22"/>
                 <w:color w:val="000000"/>
               </w:rPr>
+              <w:t xml:space="preserve">0.279</w:t>
+            </w:r>
+          </w:p>
+        </w:tc>
+        <w:tc>
+          <w:tcPr>
+            <w:tcBorders>
+              <w:bottom w:val="none" w:sz="0" w:space="0" w:color="000000"/>
+              <w:top w:val="none" w:sz="0" w:space="0" w:color="000000"/>
+              <w:left w:val="none" w:sz="0" w:space="0" w:color="000000"/>
+              <w:right w:val="none" w:sz="0" w:space="0" w:color="000000"/>
+            </w:tcBorders>
+            <w:shd w:val="clear" w:color="auto" w:fill="FFFFFF"/>
+            <w:tcMar>
+              <w:top w:w="0" w:type="dxa"/>
+              <w:bottom w:w="0" w:type="dxa"/>
+              <w:left w:w="0" w:type="dxa"/>
+              <w:right w:w="0" w:type="dxa"/>
+            </w:tcMar>
+            <w:vAlign w:val="center"/>
+          </w:tcPr>
+          <w:p>
+            <w:pPr>
+              <w:pStyle w:val="Normal"/>
+              <w:jc w:val="right"/>
+              <w:pBdr>
+                <w:bottom w:val="none" w:sz="0" w:space="0" w:color="000000"/>
+                <w:top w:val="none" w:sz="0" w:space="0" w:color="000000"/>
+                <w:left w:val="none" w:sz="0" w:space="0" w:color="000000"/>
+                <w:right w:val="none" w:sz="0" w:space="0" w:color="000000"/>
+              </w:pBdr>
+              <w:spacing w:after="100" w:before="100" w:line="240"/>
+              <w:ind w:left="100" w:right="100" w:firstLine="0" w:firstLineChars="0"/>
+            </w:pPr>
+            <w:r>
+              <w:rPr>
+                <w:rFonts w:ascii="Helvetica" w:hAnsi="Helvetica" w:eastAsia="Helvetica" w:cs="Helvetica"/>
+                <w:i w:val="false"/>
+                <w:b w:val="false"/>
+                <w:u w:val="none"/>
+                <w:sz w:val="22"/>
+                <w:szCs w:val="22"/>
+                <w:color w:val="000000"/>
+              </w:rPr>
+              <w:t xml:space="preserve">0.123</w:t>
+            </w:r>
+          </w:p>
+        </w:tc>
+        <w:tc>
+          <w:tcPr>
+            <w:tcBorders>
+              <w:bottom w:val="none" w:sz="0" w:space="0" w:color="000000"/>
+              <w:top w:val="none" w:sz="0" w:space="0" w:color="000000"/>
+              <w:left w:val="none" w:sz="0" w:space="0" w:color="000000"/>
+              <w:right w:val="none" w:sz="0" w:space="0" w:color="000000"/>
+            </w:tcBorders>
+            <w:shd w:val="clear" w:color="auto" w:fill="FFFFFF"/>
+            <w:tcMar>
+              <w:top w:w="0" w:type="dxa"/>
+              <w:bottom w:w="0" w:type="dxa"/>
+              <w:left w:w="0" w:type="dxa"/>
+              <w:right w:w="0" w:type="dxa"/>
+            </w:tcMar>
+            <w:vAlign w:val="center"/>
+          </w:tcPr>
+          <w:p>
+            <w:pPr>
+              <w:pStyle w:val="Normal"/>
+              <w:jc w:val="right"/>
+              <w:pBdr>
+                <w:bottom w:val="none" w:sz="0" w:space="0" w:color="000000"/>
+                <w:top w:val="none" w:sz="0" w:space="0" w:color="000000"/>
+                <w:left w:val="none" w:sz="0" w:space="0" w:color="000000"/>
+                <w:right w:val="none" w:sz="0" w:space="0" w:color="000000"/>
+              </w:pBdr>
+              <w:spacing w:after="100" w:before="100" w:line="240"/>
+              <w:ind w:left="100" w:right="100" w:firstLine="0" w:firstLineChars="0"/>
+            </w:pPr>
+            <w:r>
+              <w:rPr>
+                <w:rFonts w:ascii="Helvetica" w:hAnsi="Helvetica" w:eastAsia="Helvetica" w:cs="Helvetica"/>
+                <w:i w:val="false"/>
+                <w:b w:val="false"/>
+                <w:u w:val="none"/>
+                <w:sz w:val="22"/>
+                <w:szCs w:val="22"/>
+                <w:color w:val="000000"/>
+              </w:rPr>
               <w:t xml:space="preserve">72</w:t>
             </w:r>
           </w:p>
@@ -3258,6 +4273,50 @@
                 <w:color w:val="000000"/>
               </w:rPr>
               <w:t xml:space="preserve">0.353</w:t>
+            </w:r>
+          </w:p>
+        </w:tc>
+        <w:tc>
+          <w:tcPr>
+            <w:tcBorders>
+              <w:bottom w:val="none" w:sz="0" w:space="0" w:color="000000"/>
+              <w:top w:val="none" w:sz="0" w:space="0" w:color="000000"/>
+              <w:left w:val="none" w:sz="0" w:space="0" w:color="000000"/>
+              <w:right w:val="none" w:sz="0" w:space="0" w:color="000000"/>
+            </w:tcBorders>
+            <w:shd w:val="clear" w:color="auto" w:fill="FFFFFF"/>
+            <w:tcMar>
+              <w:top w:w="0" w:type="dxa"/>
+              <w:bottom w:w="0" w:type="dxa"/>
+              <w:left w:w="0" w:type="dxa"/>
+              <w:right w:w="0" w:type="dxa"/>
+            </w:tcMar>
+            <w:vAlign w:val="center"/>
+          </w:tcPr>
+          <w:p>
+            <w:pPr>
+              <w:pStyle w:val="Normal"/>
+              <w:jc w:val="right"/>
+              <w:pBdr>
+                <w:bottom w:val="none" w:sz="0" w:space="0" w:color="000000"/>
+                <w:top w:val="none" w:sz="0" w:space="0" w:color="000000"/>
+                <w:left w:val="none" w:sz="0" w:space="0" w:color="000000"/>
+                <w:right w:val="none" w:sz="0" w:space="0" w:color="000000"/>
+              </w:pBdr>
+              <w:spacing w:after="100" w:before="100" w:line="240"/>
+              <w:ind w:left="100" w:right="100" w:firstLine="0" w:firstLineChars="0"/>
+            </w:pPr>
+            <w:r>
+              <w:rPr>
+                <w:rFonts w:ascii="Helvetica" w:hAnsi="Helvetica" w:eastAsia="Helvetica" w:cs="Helvetica"/>
+                <w:i w:val="false"/>
+                <w:b w:val="false"/>
+                <w:u w:val="none"/>
+                <w:sz w:val="22"/>
+                <w:szCs w:val="22"/>
+                <w:color w:val="000000"/>
+              </w:rPr>
+              <w:t xml:space="preserve">-2.197</w:t>
             </w:r>
           </w:p>
         </w:tc>
@@ -3439,6 +4498,94 @@
                 <w:szCs w:val="22"/>
                 <w:color w:val="000000"/>
               </w:rPr>
+              <w:t xml:space="preserve">0.373</w:t>
+            </w:r>
+          </w:p>
+        </w:tc>
+        <w:tc>
+          <w:tcPr>
+            <w:tcBorders>
+              <w:bottom w:val="none" w:sz="0" w:space="0" w:color="000000"/>
+              <w:top w:val="none" w:sz="0" w:space="0" w:color="000000"/>
+              <w:left w:val="none" w:sz="0" w:space="0" w:color="000000"/>
+              <w:right w:val="none" w:sz="0" w:space="0" w:color="000000"/>
+            </w:tcBorders>
+            <w:shd w:val="clear" w:color="auto" w:fill="FFFFFF"/>
+            <w:tcMar>
+              <w:top w:w="0" w:type="dxa"/>
+              <w:bottom w:w="0" w:type="dxa"/>
+              <w:left w:w="0" w:type="dxa"/>
+              <w:right w:w="0" w:type="dxa"/>
+            </w:tcMar>
+            <w:vAlign w:val="center"/>
+          </w:tcPr>
+          <w:p>
+            <w:pPr>
+              <w:pStyle w:val="Normal"/>
+              <w:jc w:val="right"/>
+              <w:pBdr>
+                <w:bottom w:val="none" w:sz="0" w:space="0" w:color="000000"/>
+                <w:top w:val="none" w:sz="0" w:space="0" w:color="000000"/>
+                <w:left w:val="none" w:sz="0" w:space="0" w:color="000000"/>
+                <w:right w:val="none" w:sz="0" w:space="0" w:color="000000"/>
+              </w:pBdr>
+              <w:spacing w:after="100" w:before="100" w:line="240"/>
+              <w:ind w:left="100" w:right="100" w:firstLine="0" w:firstLineChars="0"/>
+            </w:pPr>
+            <w:r>
+              <w:rPr>
+                <w:rFonts w:ascii="Helvetica" w:hAnsi="Helvetica" w:eastAsia="Helvetica" w:cs="Helvetica"/>
+                <w:i w:val="false"/>
+                <w:b w:val="false"/>
+                <w:u w:val="none"/>
+                <w:sz w:val="22"/>
+                <w:szCs w:val="22"/>
+                <w:color w:val="000000"/>
+              </w:rPr>
+              <w:t xml:space="preserve">0.134</w:t>
+            </w:r>
+          </w:p>
+        </w:tc>
+        <w:tc>
+          <w:tcPr>
+            <w:tcBorders>
+              <w:bottom w:val="none" w:sz="0" w:space="0" w:color="000000"/>
+              <w:top w:val="none" w:sz="0" w:space="0" w:color="000000"/>
+              <w:left w:val="none" w:sz="0" w:space="0" w:color="000000"/>
+              <w:right w:val="none" w:sz="0" w:space="0" w:color="000000"/>
+            </w:tcBorders>
+            <w:shd w:val="clear" w:color="auto" w:fill="FFFFFF"/>
+            <w:tcMar>
+              <w:top w:w="0" w:type="dxa"/>
+              <w:bottom w:w="0" w:type="dxa"/>
+              <w:left w:w="0" w:type="dxa"/>
+              <w:right w:w="0" w:type="dxa"/>
+            </w:tcMar>
+            <w:vAlign w:val="center"/>
+          </w:tcPr>
+          <w:p>
+            <w:pPr>
+              <w:pStyle w:val="Normal"/>
+              <w:jc w:val="right"/>
+              <w:pBdr>
+                <w:bottom w:val="none" w:sz="0" w:space="0" w:color="000000"/>
+                <w:top w:val="none" w:sz="0" w:space="0" w:color="000000"/>
+                <w:left w:val="none" w:sz="0" w:space="0" w:color="000000"/>
+                <w:right w:val="none" w:sz="0" w:space="0" w:color="000000"/>
+              </w:pBdr>
+              <w:spacing w:after="100" w:before="100" w:line="240"/>
+              <w:ind w:left="100" w:right="100" w:firstLine="0" w:firstLineChars="0"/>
+            </w:pPr>
+            <w:r>
+              <w:rPr>
+                <w:rFonts w:ascii="Helvetica" w:hAnsi="Helvetica" w:eastAsia="Helvetica" w:cs="Helvetica"/>
+                <w:i w:val="false"/>
+                <w:b w:val="false"/>
+                <w:u w:val="none"/>
+                <w:sz w:val="22"/>
+                <w:szCs w:val="22"/>
+                <w:color w:val="000000"/>
+              </w:rPr>
               <w:t xml:space="preserve">72</w:t>
             </w:r>
           </w:p>
@@ -3660,6 +4807,50 @@
                 <w:color w:val="000000"/>
               </w:rPr>
               <w:t xml:space="preserve">0.520</w:t>
+            </w:r>
+          </w:p>
+        </w:tc>
+        <w:tc>
+          <w:tcPr>
+            <w:tcBorders>
+              <w:bottom w:val="none" w:sz="0" w:space="0" w:color="000000"/>
+              <w:top w:val="none" w:sz="0" w:space="0" w:color="000000"/>
+              <w:left w:val="none" w:sz="0" w:space="0" w:color="000000"/>
+              <w:right w:val="none" w:sz="0" w:space="0" w:color="000000"/>
+            </w:tcBorders>
+            <w:shd w:val="clear" w:color="auto" w:fill="FFFFFF"/>
+            <w:tcMar>
+              <w:top w:w="0" w:type="dxa"/>
+              <w:bottom w:w="0" w:type="dxa"/>
+              <w:left w:w="0" w:type="dxa"/>
+              <w:right w:w="0" w:type="dxa"/>
+            </w:tcMar>
+            <w:vAlign w:val="center"/>
+          </w:tcPr>
+          <w:p>
+            <w:pPr>
+              <w:pStyle w:val="Normal"/>
+              <w:jc w:val="right"/>
+              <w:pBdr>
+                <w:bottom w:val="none" w:sz="0" w:space="0" w:color="000000"/>
+                <w:top w:val="none" w:sz="0" w:space="0" w:color="000000"/>
+                <w:left w:val="none" w:sz="0" w:space="0" w:color="000000"/>
+                <w:right w:val="none" w:sz="0" w:space="0" w:color="000000"/>
+              </w:pBdr>
+              <w:spacing w:after="100" w:before="100" w:line="240"/>
+              <w:ind w:left="100" w:right="100" w:firstLine="0" w:firstLineChars="0"/>
+            </w:pPr>
+            <w:r>
+              <w:rPr>
+                <w:rFonts w:ascii="Helvetica" w:hAnsi="Helvetica" w:eastAsia="Helvetica" w:cs="Helvetica"/>
+                <w:i w:val="false"/>
+                <w:b w:val="false"/>
+                <w:u w:val="none"/>
+                <w:sz w:val="22"/>
+                <w:szCs w:val="22"/>
+                <w:color w:val="000000"/>
+              </w:rPr>
+              <w:t xml:space="preserve">-10.610</w:t>
             </w:r>
           </w:p>
         </w:tc>
@@ -3841,6 +5032,94 @@
                 <w:szCs w:val="22"/>
                 <w:color w:val="000000"/>
               </w:rPr>
+              <w:t xml:space="preserve">0.679</w:t>
+            </w:r>
+          </w:p>
+        </w:tc>
+        <w:tc>
+          <w:tcPr>
+            <w:tcBorders>
+              <w:bottom w:val="none" w:sz="0" w:space="0" w:color="000000"/>
+              <w:top w:val="none" w:sz="0" w:space="0" w:color="000000"/>
+              <w:left w:val="none" w:sz="0" w:space="0" w:color="000000"/>
+              <w:right w:val="none" w:sz="0" w:space="0" w:color="000000"/>
+            </w:tcBorders>
+            <w:shd w:val="clear" w:color="auto" w:fill="FFFFFF"/>
+            <w:tcMar>
+              <w:top w:w="0" w:type="dxa"/>
+              <w:bottom w:w="0" w:type="dxa"/>
+              <w:left w:w="0" w:type="dxa"/>
+              <w:right w:w="0" w:type="dxa"/>
+            </w:tcMar>
+            <w:vAlign w:val="center"/>
+          </w:tcPr>
+          <w:p>
+            <w:pPr>
+              <w:pStyle w:val="Normal"/>
+              <w:jc w:val="right"/>
+              <w:pBdr>
+                <w:bottom w:val="none" w:sz="0" w:space="0" w:color="000000"/>
+                <w:top w:val="none" w:sz="0" w:space="0" w:color="000000"/>
+                <w:left w:val="none" w:sz="0" w:space="0" w:color="000000"/>
+                <w:right w:val="none" w:sz="0" w:space="0" w:color="000000"/>
+              </w:pBdr>
+              <w:spacing w:after="100" w:before="100" w:line="240"/>
+              <w:ind w:left="100" w:right="100" w:firstLine="0" w:firstLineChars="0"/>
+            </w:pPr>
+            <w:r>
+              <w:rPr>
+                <w:rFonts w:ascii="Helvetica" w:hAnsi="Helvetica" w:eastAsia="Helvetica" w:cs="Helvetica"/>
+                <w:i w:val="false"/>
+                <w:b w:val="false"/>
+                <w:u w:val="none"/>
+                <w:sz w:val="22"/>
+                <w:szCs w:val="22"/>
+                <w:color w:val="000000"/>
+              </w:rPr>
+              <w:t xml:space="preserve">0.132</w:t>
+            </w:r>
+          </w:p>
+        </w:tc>
+        <w:tc>
+          <w:tcPr>
+            <w:tcBorders>
+              <w:bottom w:val="none" w:sz="0" w:space="0" w:color="000000"/>
+              <w:top w:val="none" w:sz="0" w:space="0" w:color="000000"/>
+              <w:left w:val="none" w:sz="0" w:space="0" w:color="000000"/>
+              <w:right w:val="none" w:sz="0" w:space="0" w:color="000000"/>
+            </w:tcBorders>
+            <w:shd w:val="clear" w:color="auto" w:fill="FFFFFF"/>
+            <w:tcMar>
+              <w:top w:w="0" w:type="dxa"/>
+              <w:bottom w:w="0" w:type="dxa"/>
+              <w:left w:w="0" w:type="dxa"/>
+              <w:right w:w="0" w:type="dxa"/>
+            </w:tcMar>
+            <w:vAlign w:val="center"/>
+          </w:tcPr>
+          <w:p>
+            <w:pPr>
+              <w:pStyle w:val="Normal"/>
+              <w:jc w:val="right"/>
+              <w:pBdr>
+                <w:bottom w:val="none" w:sz="0" w:space="0" w:color="000000"/>
+                <w:top w:val="none" w:sz="0" w:space="0" w:color="000000"/>
+                <w:left w:val="none" w:sz="0" w:space="0" w:color="000000"/>
+                <w:right w:val="none" w:sz="0" w:space="0" w:color="000000"/>
+              </w:pBdr>
+              <w:spacing w:after="100" w:before="100" w:line="240"/>
+              <w:ind w:left="100" w:right="100" w:firstLine="0" w:firstLineChars="0"/>
+            </w:pPr>
+            <w:r>
+              <w:rPr>
+                <w:rFonts w:ascii="Helvetica" w:hAnsi="Helvetica" w:eastAsia="Helvetica" w:cs="Helvetica"/>
+                <w:i w:val="false"/>
+                <w:b w:val="false"/>
+                <w:u w:val="none"/>
+                <w:sz w:val="22"/>
+                <w:szCs w:val="22"/>
+                <w:color w:val="000000"/>
+              </w:rPr>
               <w:t xml:space="preserve">72</w:t>
             </w:r>
           </w:p>
@@ -4062,6 +5341,50 @@
                 <w:color w:val="000000"/>
               </w:rPr>
               <w:t xml:space="preserve">0.800</w:t>
+            </w:r>
+          </w:p>
+        </w:tc>
+        <w:tc>
+          <w:tcPr>
+            <w:tcBorders>
+              <w:bottom w:val="none" w:sz="0" w:space="0" w:color="000000"/>
+              <w:top w:val="none" w:sz="0" w:space="0" w:color="000000"/>
+              <w:left w:val="none" w:sz="0" w:space="0" w:color="000000"/>
+              <w:right w:val="none" w:sz="0" w:space="0" w:color="000000"/>
+            </w:tcBorders>
+            <w:shd w:val="clear" w:color="auto" w:fill="FFFFFF"/>
+            <w:tcMar>
+              <w:top w:w="0" w:type="dxa"/>
+              <w:bottom w:w="0" w:type="dxa"/>
+              <w:left w:w="0" w:type="dxa"/>
+              <w:right w:w="0" w:type="dxa"/>
+            </w:tcMar>
+            <w:vAlign w:val="center"/>
+          </w:tcPr>
+          <w:p>
+            <w:pPr>
+              <w:pStyle w:val="Normal"/>
+              <w:jc w:val="right"/>
+              <w:pBdr>
+                <w:bottom w:val="none" w:sz="0" w:space="0" w:color="000000"/>
+                <w:top w:val="none" w:sz="0" w:space="0" w:color="000000"/>
+                <w:left w:val="none" w:sz="0" w:space="0" w:color="000000"/>
+                <w:right w:val="none" w:sz="0" w:space="0" w:color="000000"/>
+              </w:pBdr>
+              <w:spacing w:after="100" w:before="100" w:line="240"/>
+              <w:ind w:left="100" w:right="100" w:firstLine="0" w:firstLineChars="0"/>
+            </w:pPr>
+            <w:r>
+              <w:rPr>
+                <w:rFonts w:ascii="Helvetica" w:hAnsi="Helvetica" w:eastAsia="Helvetica" w:cs="Helvetica"/>
+                <w:i w:val="false"/>
+                <w:b w:val="false"/>
+                <w:u w:val="none"/>
+                <w:sz w:val="22"/>
+                <w:szCs w:val="22"/>
+                <w:color w:val="000000"/>
+              </w:rPr>
+              <w:t xml:space="preserve">-2.012</w:t>
             </w:r>
           </w:p>
         </w:tc>
@@ -4243,6 +5566,94 @@
                 <w:szCs w:val="22"/>
                 <w:color w:val="000000"/>
               </w:rPr>
+              <w:t xml:space="preserve"/>
+            </w:r>
+          </w:p>
+        </w:tc>
+        <w:tc>
+          <w:tcPr>
+            <w:tcBorders>
+              <w:bottom w:val="none" w:sz="0" w:space="0" w:color="000000"/>
+              <w:top w:val="none" w:sz="0" w:space="0" w:color="000000"/>
+              <w:left w:val="none" w:sz="0" w:space="0" w:color="000000"/>
+              <w:right w:val="none" w:sz="0" w:space="0" w:color="000000"/>
+            </w:tcBorders>
+            <w:shd w:val="clear" w:color="auto" w:fill="FFFFFF"/>
+            <w:tcMar>
+              <w:top w:w="0" w:type="dxa"/>
+              <w:bottom w:w="0" w:type="dxa"/>
+              <w:left w:w="0" w:type="dxa"/>
+              <w:right w:w="0" w:type="dxa"/>
+            </w:tcMar>
+            <w:vAlign w:val="center"/>
+          </w:tcPr>
+          <w:p>
+            <w:pPr>
+              <w:pStyle w:val="Normal"/>
+              <w:jc w:val="right"/>
+              <w:pBdr>
+                <w:bottom w:val="none" w:sz="0" w:space="0" w:color="000000"/>
+                <w:top w:val="none" w:sz="0" w:space="0" w:color="000000"/>
+                <w:left w:val="none" w:sz="0" w:space="0" w:color="000000"/>
+                <w:right w:val="none" w:sz="0" w:space="0" w:color="000000"/>
+              </w:pBdr>
+              <w:spacing w:after="100" w:before="100" w:line="240"/>
+              <w:ind w:left="100" w:right="100" w:firstLine="0" w:firstLineChars="0"/>
+            </w:pPr>
+            <w:r>
+              <w:rPr>
+                <w:rFonts w:ascii="Helvetica" w:hAnsi="Helvetica" w:eastAsia="Helvetica" w:cs="Helvetica"/>
+                <w:i w:val="false"/>
+                <w:b w:val="false"/>
+                <w:u w:val="none"/>
+                <w:sz w:val="22"/>
+                <w:szCs w:val="22"/>
+                <w:color w:val="000000"/>
+              </w:rPr>
+              <w:t xml:space="preserve"/>
+            </w:r>
+          </w:p>
+        </w:tc>
+        <w:tc>
+          <w:tcPr>
+            <w:tcBorders>
+              <w:bottom w:val="none" w:sz="0" w:space="0" w:color="000000"/>
+              <w:top w:val="none" w:sz="0" w:space="0" w:color="000000"/>
+              <w:left w:val="none" w:sz="0" w:space="0" w:color="000000"/>
+              <w:right w:val="none" w:sz="0" w:space="0" w:color="000000"/>
+            </w:tcBorders>
+            <w:shd w:val="clear" w:color="auto" w:fill="FFFFFF"/>
+            <w:tcMar>
+              <w:top w:w="0" w:type="dxa"/>
+              <w:bottom w:w="0" w:type="dxa"/>
+              <w:left w:w="0" w:type="dxa"/>
+              <w:right w:w="0" w:type="dxa"/>
+            </w:tcMar>
+            <w:vAlign w:val="center"/>
+          </w:tcPr>
+          <w:p>
+            <w:pPr>
+              <w:pStyle w:val="Normal"/>
+              <w:jc w:val="right"/>
+              <w:pBdr>
+                <w:bottom w:val="none" w:sz="0" w:space="0" w:color="000000"/>
+                <w:top w:val="none" w:sz="0" w:space="0" w:color="000000"/>
+                <w:left w:val="none" w:sz="0" w:space="0" w:color="000000"/>
+                <w:right w:val="none" w:sz="0" w:space="0" w:color="000000"/>
+              </w:pBdr>
+              <w:spacing w:after="100" w:before="100" w:line="240"/>
+              <w:ind w:left="100" w:right="100" w:firstLine="0" w:firstLineChars="0"/>
+            </w:pPr>
+            <w:r>
+              <w:rPr>
+                <w:rFonts w:ascii="Helvetica" w:hAnsi="Helvetica" w:eastAsia="Helvetica" w:cs="Helvetica"/>
+                <w:i w:val="false"/>
+                <w:b w:val="false"/>
+                <w:u w:val="none"/>
+                <w:sz w:val="22"/>
+                <w:szCs w:val="22"/>
+                <w:color w:val="000000"/>
+              </w:rPr>
               <w:t xml:space="preserve">72</w:t>
             </w:r>
           </w:p>
@@ -4464,6 +5875,50 @@
                 <w:color w:val="000000"/>
               </w:rPr>
               <w:t xml:space="preserve">2.531</w:t>
+            </w:r>
+          </w:p>
+        </w:tc>
+        <w:tc>
+          <w:tcPr>
+            <w:tcBorders>
+              <w:bottom w:val="none" w:sz="0" w:space="0" w:color="000000"/>
+              <w:top w:val="none" w:sz="0" w:space="0" w:color="000000"/>
+              <w:left w:val="none" w:sz="0" w:space="0" w:color="000000"/>
+              <w:right w:val="none" w:sz="0" w:space="0" w:color="000000"/>
+            </w:tcBorders>
+            <w:shd w:val="clear" w:color="auto" w:fill="FFFFFF"/>
+            <w:tcMar>
+              <w:top w:w="0" w:type="dxa"/>
+              <w:bottom w:w="0" w:type="dxa"/>
+              <w:left w:w="0" w:type="dxa"/>
+              <w:right w:w="0" w:type="dxa"/>
+            </w:tcMar>
+            <w:vAlign w:val="center"/>
+          </w:tcPr>
+          <w:p>
+            <w:pPr>
+              <w:pStyle w:val="Normal"/>
+              <w:jc w:val="right"/>
+              <w:pBdr>
+                <w:bottom w:val="none" w:sz="0" w:space="0" w:color="000000"/>
+                <w:top w:val="none" w:sz="0" w:space="0" w:color="000000"/>
+                <w:left w:val="none" w:sz="0" w:space="0" w:color="000000"/>
+                <w:right w:val="none" w:sz="0" w:space="0" w:color="000000"/>
+              </w:pBdr>
+              <w:spacing w:after="100" w:before="100" w:line="240"/>
+              <w:ind w:left="100" w:right="100" w:firstLine="0" w:firstLineChars="0"/>
+            </w:pPr>
+            <w:r>
+              <w:rPr>
+                <w:rFonts w:ascii="Helvetica" w:hAnsi="Helvetica" w:eastAsia="Helvetica" w:cs="Helvetica"/>
+                <w:i w:val="false"/>
+                <w:b w:val="false"/>
+                <w:u w:val="none"/>
+                <w:sz w:val="22"/>
+                <w:szCs w:val="22"/>
+                <w:color w:val="000000"/>
+              </w:rPr>
+              <w:t xml:space="preserve">30.520</w:t>
             </w:r>
           </w:p>
         </w:tc>
@@ -4645,6 +6100,94 @@
                 <w:szCs w:val="22"/>
                 <w:color w:val="000000"/>
               </w:rPr>
+              <w:t xml:space="preserve"/>
+            </w:r>
+          </w:p>
+        </w:tc>
+        <w:tc>
+          <w:tcPr>
+            <w:tcBorders>
+              <w:bottom w:val="none" w:sz="0" w:space="0" w:color="000000"/>
+              <w:top w:val="none" w:sz="0" w:space="0" w:color="000000"/>
+              <w:left w:val="none" w:sz="0" w:space="0" w:color="000000"/>
+              <w:right w:val="none" w:sz="0" w:space="0" w:color="000000"/>
+            </w:tcBorders>
+            <w:shd w:val="clear" w:color="auto" w:fill="FFFFFF"/>
+            <w:tcMar>
+              <w:top w:w="0" w:type="dxa"/>
+              <w:bottom w:w="0" w:type="dxa"/>
+              <w:left w:w="0" w:type="dxa"/>
+              <w:right w:w="0" w:type="dxa"/>
+            </w:tcMar>
+            <w:vAlign w:val="center"/>
+          </w:tcPr>
+          <w:p>
+            <w:pPr>
+              <w:pStyle w:val="Normal"/>
+              <w:jc w:val="right"/>
+              <w:pBdr>
+                <w:bottom w:val="none" w:sz="0" w:space="0" w:color="000000"/>
+                <w:top w:val="none" w:sz="0" w:space="0" w:color="000000"/>
+                <w:left w:val="none" w:sz="0" w:space="0" w:color="000000"/>
+                <w:right w:val="none" w:sz="0" w:space="0" w:color="000000"/>
+              </w:pBdr>
+              <w:spacing w:after="100" w:before="100" w:line="240"/>
+              <w:ind w:left="100" w:right="100" w:firstLine="0" w:firstLineChars="0"/>
+            </w:pPr>
+            <w:r>
+              <w:rPr>
+                <w:rFonts w:ascii="Helvetica" w:hAnsi="Helvetica" w:eastAsia="Helvetica" w:cs="Helvetica"/>
+                <w:i w:val="false"/>
+                <w:b w:val="false"/>
+                <w:u w:val="none"/>
+                <w:sz w:val="22"/>
+                <w:szCs w:val="22"/>
+                <w:color w:val="000000"/>
+              </w:rPr>
+              <w:t xml:space="preserve"/>
+            </w:r>
+          </w:p>
+        </w:tc>
+        <w:tc>
+          <w:tcPr>
+            <w:tcBorders>
+              <w:bottom w:val="none" w:sz="0" w:space="0" w:color="000000"/>
+              <w:top w:val="none" w:sz="0" w:space="0" w:color="000000"/>
+              <w:left w:val="none" w:sz="0" w:space="0" w:color="000000"/>
+              <w:right w:val="none" w:sz="0" w:space="0" w:color="000000"/>
+            </w:tcBorders>
+            <w:shd w:val="clear" w:color="auto" w:fill="FFFFFF"/>
+            <w:tcMar>
+              <w:top w:w="0" w:type="dxa"/>
+              <w:bottom w:w="0" w:type="dxa"/>
+              <w:left w:w="0" w:type="dxa"/>
+              <w:right w:w="0" w:type="dxa"/>
+            </w:tcMar>
+            <w:vAlign w:val="center"/>
+          </w:tcPr>
+          <w:p>
+            <w:pPr>
+              <w:pStyle w:val="Normal"/>
+              <w:jc w:val="right"/>
+              <w:pBdr>
+                <w:bottom w:val="none" w:sz="0" w:space="0" w:color="000000"/>
+                <w:top w:val="none" w:sz="0" w:space="0" w:color="000000"/>
+                <w:left w:val="none" w:sz="0" w:space="0" w:color="000000"/>
+                <w:right w:val="none" w:sz="0" w:space="0" w:color="000000"/>
+              </w:pBdr>
+              <w:spacing w:after="100" w:before="100" w:line="240"/>
+              <w:ind w:left="100" w:right="100" w:firstLine="0" w:firstLineChars="0"/>
+            </w:pPr>
+            <w:r>
+              <w:rPr>
+                <w:rFonts w:ascii="Helvetica" w:hAnsi="Helvetica" w:eastAsia="Helvetica" w:cs="Helvetica"/>
+                <w:i w:val="false"/>
+                <w:b w:val="false"/>
+                <w:u w:val="none"/>
+                <w:sz w:val="22"/>
+                <w:szCs w:val="22"/>
+                <w:color w:val="000000"/>
+              </w:rPr>
               <w:t xml:space="preserve">72</w:t>
             </w:r>
           </w:p>
@@ -4866,6 +6409,50 @@
                 <w:color w:val="000000"/>
               </w:rPr>
               <w:t xml:space="preserve">2.873</w:t>
+            </w:r>
+          </w:p>
+        </w:tc>
+        <w:tc>
+          <w:tcPr>
+            <w:tcBorders>
+              <w:bottom w:val="none" w:sz="0" w:space="0" w:color="000000"/>
+              <w:top w:val="none" w:sz="0" w:space="0" w:color="000000"/>
+              <w:left w:val="none" w:sz="0" w:space="0" w:color="000000"/>
+              <w:right w:val="none" w:sz="0" w:space="0" w:color="000000"/>
+            </w:tcBorders>
+            <w:shd w:val="clear" w:color="auto" w:fill="FFFFFF"/>
+            <w:tcMar>
+              <w:top w:w="0" w:type="dxa"/>
+              <w:bottom w:w="0" w:type="dxa"/>
+              <w:left w:w="0" w:type="dxa"/>
+              <w:right w:w="0" w:type="dxa"/>
+            </w:tcMar>
+            <w:vAlign w:val="center"/>
+          </w:tcPr>
+          <w:p>
+            <w:pPr>
+              <w:pStyle w:val="Normal"/>
+              <w:jc w:val="right"/>
+              <w:pBdr>
+                <w:bottom w:val="none" w:sz="0" w:space="0" w:color="000000"/>
+                <w:top w:val="none" w:sz="0" w:space="0" w:color="000000"/>
+                <w:left w:val="none" w:sz="0" w:space="0" w:color="000000"/>
+                <w:right w:val="none" w:sz="0" w:space="0" w:color="000000"/>
+              </w:pBdr>
+              <w:spacing w:after="100" w:before="100" w:line="240"/>
+              <w:ind w:left="100" w:right="100" w:firstLine="0" w:firstLineChars="0"/>
+            </w:pPr>
+            <w:r>
+              <w:rPr>
+                <w:rFonts w:ascii="Helvetica" w:hAnsi="Helvetica" w:eastAsia="Helvetica" w:cs="Helvetica"/>
+                <w:i w:val="false"/>
+                <w:b w:val="false"/>
+                <w:u w:val="none"/>
+                <w:sz w:val="22"/>
+                <w:szCs w:val="22"/>
+                <w:color w:val="000000"/>
+              </w:rPr>
+              <w:t xml:space="preserve">7.296</w:t>
             </w:r>
           </w:p>
         </w:tc>
@@ -5047,6 +6634,94 @@
                 <w:szCs w:val="22"/>
                 <w:color w:val="000000"/>
               </w:rPr>
+              <w:t xml:space="preserve">-1.700</w:t>
+            </w:r>
+          </w:p>
+        </w:tc>
+        <w:tc>
+          <w:tcPr>
+            <w:tcBorders>
+              <w:bottom w:val="single" w:sz="12" w:space="0" w:color="666666"/>
+              <w:top w:val="none" w:sz="0" w:space="0" w:color="000000"/>
+              <w:left w:val="none" w:sz="0" w:space="0" w:color="000000"/>
+              <w:right w:val="none" w:sz="0" w:space="0" w:color="000000"/>
+            </w:tcBorders>
+            <w:shd w:val="clear" w:color="auto" w:fill="FFFFFF"/>
+            <w:tcMar>
+              <w:top w:w="0" w:type="dxa"/>
+              <w:bottom w:w="0" w:type="dxa"/>
+              <w:left w:w="0" w:type="dxa"/>
+              <w:right w:w="0" w:type="dxa"/>
+            </w:tcMar>
+            <w:vAlign w:val="center"/>
+          </w:tcPr>
+          <w:p>
+            <w:pPr>
+              <w:pStyle w:val="Normal"/>
+              <w:jc w:val="right"/>
+              <w:pBdr>
+                <w:bottom w:val="none" w:sz="0" w:space="0" w:color="000000"/>
+                <w:top w:val="none" w:sz="0" w:space="0" w:color="000000"/>
+                <w:left w:val="none" w:sz="0" w:space="0" w:color="000000"/>
+                <w:right w:val="none" w:sz="0" w:space="0" w:color="000000"/>
+              </w:pBdr>
+              <w:spacing w:after="100" w:before="100" w:line="240"/>
+              <w:ind w:left="100" w:right="100" w:firstLine="0" w:firstLineChars="0"/>
+            </w:pPr>
+            <w:r>
+              <w:rPr>
+                <w:rFonts w:ascii="Helvetica" w:hAnsi="Helvetica" w:eastAsia="Helvetica" w:cs="Helvetica"/>
+                <w:i w:val="false"/>
+                <w:b w:val="false"/>
+                <w:u w:val="none"/>
+                <w:sz w:val="22"/>
+                <w:szCs w:val="22"/>
+                <w:color w:val="000000"/>
+              </w:rPr>
+              <w:t xml:space="preserve">0.458</w:t>
+            </w:r>
+          </w:p>
+        </w:tc>
+        <w:tc>
+          <w:tcPr>
+            <w:tcBorders>
+              <w:bottom w:val="single" w:sz="12" w:space="0" w:color="666666"/>
+              <w:top w:val="none" w:sz="0" w:space="0" w:color="000000"/>
+              <w:left w:val="none" w:sz="0" w:space="0" w:color="000000"/>
+              <w:right w:val="none" w:sz="0" w:space="0" w:color="000000"/>
+            </w:tcBorders>
+            <w:shd w:val="clear" w:color="auto" w:fill="FFFFFF"/>
+            <w:tcMar>
+              <w:top w:w="0" w:type="dxa"/>
+              <w:bottom w:w="0" w:type="dxa"/>
+              <w:left w:w="0" w:type="dxa"/>
+              <w:right w:w="0" w:type="dxa"/>
+            </w:tcMar>
+            <w:vAlign w:val="center"/>
+          </w:tcPr>
+          <w:p>
+            <w:pPr>
+              <w:pStyle w:val="Normal"/>
+              <w:jc w:val="right"/>
+              <w:pBdr>
+                <w:bottom w:val="none" w:sz="0" w:space="0" w:color="000000"/>
+                <w:top w:val="none" w:sz="0" w:space="0" w:color="000000"/>
+                <w:left w:val="none" w:sz="0" w:space="0" w:color="000000"/>
+                <w:right w:val="none" w:sz="0" w:space="0" w:color="000000"/>
+              </w:pBdr>
+              <w:spacing w:after="100" w:before="100" w:line="240"/>
+              <w:ind w:left="100" w:right="100" w:firstLine="0" w:firstLineChars="0"/>
+            </w:pPr>
+            <w:r>
+              <w:rPr>
+                <w:rFonts w:ascii="Helvetica" w:hAnsi="Helvetica" w:eastAsia="Helvetica" w:cs="Helvetica"/>
+                <w:i w:val="false"/>
+                <w:b w:val="false"/>
+                <w:u w:val="none"/>
+                <w:sz w:val="22"/>
+                <w:szCs w:val="22"/>
+                <w:color w:val="000000"/>
+              </w:rPr>
               <w:t xml:space="preserve">72</w:t>
             </w:r>
           </w:p>
@@ -5268,6 +6943,50 @@
                 <w:color w:val="000000"/>
               </w:rPr>
               <w:t xml:space="preserve">2.482</w:t>
+            </w:r>
+          </w:p>
+        </w:tc>
+        <w:tc>
+          <w:tcPr>
+            <w:tcBorders>
+              <w:bottom w:val="single" w:sz="12" w:space="0" w:color="666666"/>
+              <w:top w:val="none" w:sz="0" w:space="0" w:color="000000"/>
+              <w:left w:val="none" w:sz="0" w:space="0" w:color="000000"/>
+              <w:right w:val="none" w:sz="0" w:space="0" w:color="000000"/>
+            </w:tcBorders>
+            <w:shd w:val="clear" w:color="auto" w:fill="FFFFFF"/>
+            <w:tcMar>
+              <w:top w:w="0" w:type="dxa"/>
+              <w:bottom w:w="0" w:type="dxa"/>
+              <w:left w:w="0" w:type="dxa"/>
+              <w:right w:w="0" w:type="dxa"/>
+            </w:tcMar>
+            <w:vAlign w:val="center"/>
+          </w:tcPr>
+          <w:p>
+            <w:pPr>
+              <w:pStyle w:val="Normal"/>
+              <w:jc w:val="right"/>
+              <w:pBdr>
+                <w:bottom w:val="none" w:sz="0" w:space="0" w:color="000000"/>
+                <w:top w:val="none" w:sz="0" w:space="0" w:color="000000"/>
+                <w:left w:val="none" w:sz="0" w:space="0" w:color="000000"/>
+                <w:right w:val="none" w:sz="0" w:space="0" w:color="000000"/>
+              </w:pBdr>
+              <w:spacing w:after="100" w:before="100" w:line="240"/>
+              <w:ind w:left="100" w:right="100" w:firstLine="0" w:firstLineChars="0"/>
+            </w:pPr>
+            <w:r>
+              <w:rPr>
+                <w:rFonts w:ascii="Helvetica" w:hAnsi="Helvetica" w:eastAsia="Helvetica" w:cs="Helvetica"/>
+                <w:i w:val="false"/>
+                <w:b w:val="false"/>
+                <w:u w:val="none"/>
+                <w:sz w:val="22"/>
+                <w:szCs w:val="22"/>
+                <w:color w:val="000000"/>
+              </w:rPr>
+              <w:t xml:space="preserve">20.106</w:t>
             </w:r>
           </w:p>
         </w:tc>
@@ -5309,16 +7028,19 @@
         <w:gridCol w:w="1401"/>
         <w:gridCol w:w="1291"/>
         <w:gridCol w:w="2184"/>
+        <w:gridCol w:w="1854"/>
+        <w:gridCol w:w="1621"/>
         <w:gridCol w:w="655"/>
         <w:gridCol w:w="1046"/>
         <w:gridCol w:w="961"/>
         <w:gridCol w:w="961"/>
         <w:gridCol w:w="1034"/>
         <w:gridCol w:w="961"/>
+        <w:gridCol w:w="1157"/>
       </w:tblGrid>
       <w:tr>
         <w:trPr>
-          <w:trHeight w:val="618" w:hRule="auto"/>
+          <w:trHeight w:val="619" w:hRule="auto"/>
           <w:tblHeader/>
         </w:trPr>
         header 1
@@ -5494,7 +7216,7 @@
                 <w:szCs w:val="22"/>
                 <w:color w:val="000000"/>
               </w:rPr>
-              <w:t xml:space="preserve">N</w:t>
+              <w:t xml:space="preserve">Intercept value</w:t>
             </w:r>
           </w:p>
         </w:tc>
@@ -5538,7 +7260,7 @@
                 <w:szCs w:val="22"/>
                 <w:color w:val="000000"/>
               </w:rPr>
-              <w:t xml:space="preserve">RMSE</w:t>
+              <w:t xml:space="preserve">Intercept SE</w:t>
             </w:r>
           </w:p>
         </w:tc>
@@ -5582,7 +7304,7 @@
                 <w:szCs w:val="22"/>
                 <w:color w:val="000000"/>
               </w:rPr>
-              <w:t xml:space="preserve">MAE</w:t>
+              <w:t xml:space="preserve">N</w:t>
             </w:r>
           </w:p>
         </w:tc>
@@ -5626,7 +7348,7 @@
                 <w:szCs w:val="22"/>
                 <w:color w:val="000000"/>
               </w:rPr>
-              <w:t xml:space="preserve">MSE</w:t>
+              <w:t xml:space="preserve">RMSE</w:t>
             </w:r>
           </w:p>
         </w:tc>
@@ -5670,7 +7392,7 @@
                 <w:szCs w:val="22"/>
                 <w:color w:val="000000"/>
               </w:rPr>
-              <w:t xml:space="preserve">MSD</w:t>
+              <w:t xml:space="preserve">MAE</w:t>
             </w:r>
           </w:p>
         </w:tc>
@@ -5714,7 +7436,139 @@
                 <w:szCs w:val="22"/>
                 <w:color w:val="000000"/>
               </w:rPr>
+              <w:t xml:space="preserve">MSE</w:t>
+            </w:r>
+          </w:p>
+        </w:tc>
+        <w:tc>
+          <w:tcPr>
+            <w:tcBorders>
+              <w:bottom w:val="single" w:sz="12" w:space="0" w:color="666666"/>
+              <w:top w:val="single" w:sz="12" w:space="0" w:color="666666"/>
+              <w:left w:val="none" w:sz="0" w:space="0" w:color="000000"/>
+              <w:right w:val="none" w:sz="0" w:space="0" w:color="000000"/>
+            </w:tcBorders>
+            <w:shd w:val="clear" w:color="auto" w:fill="FFFFFF"/>
+            <w:tcMar>
+              <w:top w:w="0" w:type="dxa"/>
+              <w:bottom w:w="0" w:type="dxa"/>
+              <w:left w:w="0" w:type="dxa"/>
+              <w:right w:w="0" w:type="dxa"/>
+            </w:tcMar>
+            <w:vAlign w:val="center"/>
+          </w:tcPr>
+          <w:p>
+            <w:pPr>
+              <w:pStyle w:val="Normal"/>
+              <w:jc w:val="right"/>
+              <w:pBdr>
+                <w:bottom w:val="none" w:sz="0" w:space="0" w:color="000000"/>
+                <w:top w:val="none" w:sz="0" w:space="0" w:color="000000"/>
+                <w:left w:val="none" w:sz="0" w:space="0" w:color="000000"/>
+                <w:right w:val="none" w:sz="0" w:space="0" w:color="000000"/>
+              </w:pBdr>
+              <w:spacing w:after="100" w:before="100" w:line="240"/>
+              <w:ind w:left="100" w:right="100" w:firstLine="0" w:firstLineChars="0"/>
+            </w:pPr>
+            <w:r>
+              <w:rPr>
+                <w:rFonts w:ascii="Helvetica" w:hAnsi="Helvetica" w:eastAsia="Helvetica" w:cs="Helvetica"/>
+                <w:i w:val="false"/>
+                <w:b w:val="false"/>
+                <w:u w:val="none"/>
+                <w:sz w:val="22"/>
+                <w:szCs w:val="22"/>
+                <w:color w:val="000000"/>
+              </w:rPr>
+              <w:t xml:space="preserve">MSD</w:t>
+            </w:r>
+          </w:p>
+        </w:tc>
+        <w:tc>
+          <w:tcPr>
+            <w:tcBorders>
+              <w:bottom w:val="single" w:sz="12" w:space="0" w:color="666666"/>
+              <w:top w:val="single" w:sz="12" w:space="0" w:color="666666"/>
+              <w:left w:val="none" w:sz="0" w:space="0" w:color="000000"/>
+              <w:right w:val="none" w:sz="0" w:space="0" w:color="000000"/>
+            </w:tcBorders>
+            <w:shd w:val="clear" w:color="auto" w:fill="FFFFFF"/>
+            <w:tcMar>
+              <w:top w:w="0" w:type="dxa"/>
+              <w:bottom w:w="0" w:type="dxa"/>
+              <w:left w:w="0" w:type="dxa"/>
+              <w:right w:w="0" w:type="dxa"/>
+            </w:tcMar>
+            <w:vAlign w:val="center"/>
+          </w:tcPr>
+          <w:p>
+            <w:pPr>
+              <w:pStyle w:val="Normal"/>
+              <w:jc w:val="right"/>
+              <w:pBdr>
+                <w:bottom w:val="none" w:sz="0" w:space="0" w:color="000000"/>
+                <w:top w:val="none" w:sz="0" w:space="0" w:color="000000"/>
+                <w:left w:val="none" w:sz="0" w:space="0" w:color="000000"/>
+                <w:right w:val="none" w:sz="0" w:space="0" w:color="000000"/>
+              </w:pBdr>
+              <w:spacing w:after="100" w:before="100" w:line="240"/>
+              <w:ind w:left="100" w:right="100" w:firstLine="0" w:firstLineChars="0"/>
+            </w:pPr>
+            <w:r>
+              <w:rPr>
+                <w:rFonts w:ascii="Helvetica" w:hAnsi="Helvetica" w:eastAsia="Helvetica" w:cs="Helvetica"/>
+                <w:i w:val="false"/>
+                <w:b w:val="false"/>
+                <w:u w:val="none"/>
+                <w:sz w:val="22"/>
+                <w:szCs w:val="22"/>
+                <w:color w:val="000000"/>
+              </w:rPr>
               <w:t xml:space="preserve">MAD</w:t>
+            </w:r>
+          </w:p>
+        </w:tc>
+        <w:tc>
+          <w:tcPr>
+            <w:tcBorders>
+              <w:bottom w:val="single" w:sz="12" w:space="0" w:color="666666"/>
+              <w:top w:val="single" w:sz="12" w:space="0" w:color="666666"/>
+              <w:left w:val="none" w:sz="0" w:space="0" w:color="000000"/>
+              <w:right w:val="none" w:sz="0" w:space="0" w:color="000000"/>
+            </w:tcBorders>
+            <w:shd w:val="clear" w:color="auto" w:fill="FFFFFF"/>
+            <w:tcMar>
+              <w:top w:w="0" w:type="dxa"/>
+              <w:bottom w:w="0" w:type="dxa"/>
+              <w:left w:w="0" w:type="dxa"/>
+              <w:right w:w="0" w:type="dxa"/>
+            </w:tcMar>
+            <w:vAlign w:val="center"/>
+          </w:tcPr>
+          <w:p>
+            <w:pPr>
+              <w:pStyle w:val="Normal"/>
+              <w:jc w:val="right"/>
+              <w:pBdr>
+                <w:bottom w:val="none" w:sz="0" w:space="0" w:color="000000"/>
+                <w:top w:val="none" w:sz="0" w:space="0" w:color="000000"/>
+                <w:left w:val="none" w:sz="0" w:space="0" w:color="000000"/>
+                <w:right w:val="none" w:sz="0" w:space="0" w:color="000000"/>
+              </w:pBdr>
+              <w:spacing w:after="100" w:before="100" w:line="240"/>
+              <w:ind w:left="100" w:right="100" w:firstLine="0" w:firstLineChars="0"/>
+            </w:pPr>
+            <w:r>
+              <w:rPr>
+                <w:rFonts w:ascii="Helvetica" w:hAnsi="Helvetica" w:eastAsia="Helvetica" w:cs="Helvetica"/>
+                <w:i w:val="false"/>
+                <w:b w:val="false"/>
+                <w:u w:val="none"/>
+                <w:sz w:val="22"/>
+                <w:szCs w:val="22"/>
+                <w:color w:val="000000"/>
+              </w:rPr>
+              <w:t xml:space="preserve">MRSD</w:t>
             </w:r>
           </w:p>
         </w:tc>
@@ -5896,6 +7750,94 @@
                 <w:szCs w:val="22"/>
                 <w:color w:val="000000"/>
               </w:rPr>
+              <w:t xml:space="preserve">0.066</w:t>
+            </w:r>
+          </w:p>
+        </w:tc>
+        <w:tc>
+          <w:tcPr>
+            <w:tcBorders>
+              <w:bottom w:val="none" w:sz="0" w:space="0" w:color="000000"/>
+              <w:top w:val="single" w:sz="12" w:space="0" w:color="666666"/>
+              <w:left w:val="none" w:sz="0" w:space="0" w:color="000000"/>
+              <w:right w:val="none" w:sz="0" w:space="0" w:color="000000"/>
+            </w:tcBorders>
+            <w:shd w:val="clear" w:color="auto" w:fill="FFFFFF"/>
+            <w:tcMar>
+              <w:top w:w="0" w:type="dxa"/>
+              <w:bottom w:w="0" w:type="dxa"/>
+              <w:left w:w="0" w:type="dxa"/>
+              <w:right w:w="0" w:type="dxa"/>
+            </w:tcMar>
+            <w:vAlign w:val="center"/>
+          </w:tcPr>
+          <w:p>
+            <w:pPr>
+              <w:pStyle w:val="Normal"/>
+              <w:jc w:val="right"/>
+              <w:pBdr>
+                <w:bottom w:val="none" w:sz="0" w:space="0" w:color="000000"/>
+                <w:top w:val="none" w:sz="0" w:space="0" w:color="000000"/>
+                <w:left w:val="none" w:sz="0" w:space="0" w:color="000000"/>
+                <w:right w:val="none" w:sz="0" w:space="0" w:color="000000"/>
+              </w:pBdr>
+              <w:spacing w:after="100" w:before="100" w:line="240"/>
+              <w:ind w:left="100" w:right="100" w:firstLine="0" w:firstLineChars="0"/>
+            </w:pPr>
+            <w:r>
+              <w:rPr>
+                <w:rFonts w:ascii="Helvetica" w:hAnsi="Helvetica" w:eastAsia="Helvetica" w:cs="Helvetica"/>
+                <w:i w:val="false"/>
+                <w:b w:val="false"/>
+                <w:u w:val="none"/>
+                <w:sz w:val="22"/>
+                <w:szCs w:val="22"/>
+                <w:color w:val="000000"/>
+              </w:rPr>
+              <w:t xml:space="preserve">0.013</w:t>
+            </w:r>
+          </w:p>
+        </w:tc>
+        <w:tc>
+          <w:tcPr>
+            <w:tcBorders>
+              <w:bottom w:val="none" w:sz="0" w:space="0" w:color="000000"/>
+              <w:top w:val="single" w:sz="12" w:space="0" w:color="666666"/>
+              <w:left w:val="none" w:sz="0" w:space="0" w:color="000000"/>
+              <w:right w:val="none" w:sz="0" w:space="0" w:color="000000"/>
+            </w:tcBorders>
+            <w:shd w:val="clear" w:color="auto" w:fill="FFFFFF"/>
+            <w:tcMar>
+              <w:top w:w="0" w:type="dxa"/>
+              <w:bottom w:w="0" w:type="dxa"/>
+              <w:left w:w="0" w:type="dxa"/>
+              <w:right w:w="0" w:type="dxa"/>
+            </w:tcMar>
+            <w:vAlign w:val="center"/>
+          </w:tcPr>
+          <w:p>
+            <w:pPr>
+              <w:pStyle w:val="Normal"/>
+              <w:jc w:val="right"/>
+              <w:pBdr>
+                <w:bottom w:val="none" w:sz="0" w:space="0" w:color="000000"/>
+                <w:top w:val="none" w:sz="0" w:space="0" w:color="000000"/>
+                <w:left w:val="none" w:sz="0" w:space="0" w:color="000000"/>
+                <w:right w:val="none" w:sz="0" w:space="0" w:color="000000"/>
+              </w:pBdr>
+              <w:spacing w:after="100" w:before="100" w:line="240"/>
+              <w:ind w:left="100" w:right="100" w:firstLine="0" w:firstLineChars="0"/>
+            </w:pPr>
+            <w:r>
+              <w:rPr>
+                <w:rFonts w:ascii="Helvetica" w:hAnsi="Helvetica" w:eastAsia="Helvetica" w:cs="Helvetica"/>
+                <w:i w:val="false"/>
+                <w:b w:val="false"/>
+                <w:u w:val="none"/>
+                <w:sz w:val="22"/>
+                <w:szCs w:val="22"/>
+                <w:color w:val="000000"/>
+              </w:rPr>
               <w:t xml:space="preserve">72</w:t>
             </w:r>
           </w:p>
@@ -6117,6 +8059,50 @@
                 <w:color w:val="000000"/>
               </w:rPr>
               <w:t xml:space="preserve">0.061</w:t>
+            </w:r>
+          </w:p>
+        </w:tc>
+        <w:tc>
+          <w:tcPr>
+            <w:tcBorders>
+              <w:bottom w:val="none" w:sz="0" w:space="0" w:color="000000"/>
+              <w:top w:val="single" w:sz="12" w:space="0" w:color="666666"/>
+              <w:left w:val="none" w:sz="0" w:space="0" w:color="000000"/>
+              <w:right w:val="none" w:sz="0" w:space="0" w:color="000000"/>
+            </w:tcBorders>
+            <w:shd w:val="clear" w:color="auto" w:fill="FFFFFF"/>
+            <w:tcMar>
+              <w:top w:w="0" w:type="dxa"/>
+              <w:bottom w:w="0" w:type="dxa"/>
+              <w:left w:w="0" w:type="dxa"/>
+              <w:right w:w="0" w:type="dxa"/>
+            </w:tcMar>
+            <w:vAlign w:val="center"/>
+          </w:tcPr>
+          <w:p>
+            <w:pPr>
+              <w:pStyle w:val="Normal"/>
+              <w:jc w:val="right"/>
+              <w:pBdr>
+                <w:bottom w:val="none" w:sz="0" w:space="0" w:color="000000"/>
+                <w:top w:val="none" w:sz="0" w:space="0" w:color="000000"/>
+                <w:left w:val="none" w:sz="0" w:space="0" w:color="000000"/>
+                <w:right w:val="none" w:sz="0" w:space="0" w:color="000000"/>
+              </w:pBdr>
+              <w:spacing w:after="100" w:before="100" w:line="240"/>
+              <w:ind w:left="100" w:right="100" w:firstLine="0" w:firstLineChars="0"/>
+            </w:pPr>
+            <w:r>
+              <w:rPr>
+                <w:rFonts w:ascii="Helvetica" w:hAnsi="Helvetica" w:eastAsia="Helvetica" w:cs="Helvetica"/>
+                <w:i w:val="false"/>
+                <w:b w:val="false"/>
+                <w:u w:val="none"/>
+                <w:sz w:val="22"/>
+                <w:szCs w:val="22"/>
+                <w:color w:val="000000"/>
+              </w:rPr>
+              <w:t xml:space="preserve">-15.799</w:t>
             </w:r>
           </w:p>
         </w:tc>
@@ -6298,6 +8284,94 @@
                 <w:szCs w:val="22"/>
                 <w:color w:val="000000"/>
               </w:rPr>
+              <w:t xml:space="preserve">-0.076</w:t>
+            </w:r>
+          </w:p>
+        </w:tc>
+        <w:tc>
+          <w:tcPr>
+            <w:tcBorders>
+              <w:bottom w:val="none" w:sz="0" w:space="0" w:color="000000"/>
+              <w:top w:val="none" w:sz="0" w:space="0" w:color="000000"/>
+              <w:left w:val="none" w:sz="0" w:space="0" w:color="000000"/>
+              <w:right w:val="none" w:sz="0" w:space="0" w:color="000000"/>
+            </w:tcBorders>
+            <w:shd w:val="clear" w:color="auto" w:fill="FFFFFF"/>
+            <w:tcMar>
+              <w:top w:w="0" w:type="dxa"/>
+              <w:bottom w:w="0" w:type="dxa"/>
+              <w:left w:w="0" w:type="dxa"/>
+              <w:right w:w="0" w:type="dxa"/>
+            </w:tcMar>
+            <w:vAlign w:val="center"/>
+          </w:tcPr>
+          <w:p>
+            <w:pPr>
+              <w:pStyle w:val="Normal"/>
+              <w:jc w:val="right"/>
+              <w:pBdr>
+                <w:bottom w:val="none" w:sz="0" w:space="0" w:color="000000"/>
+                <w:top w:val="none" w:sz="0" w:space="0" w:color="000000"/>
+                <w:left w:val="none" w:sz="0" w:space="0" w:color="000000"/>
+                <w:right w:val="none" w:sz="0" w:space="0" w:color="000000"/>
+              </w:pBdr>
+              <w:spacing w:after="100" w:before="100" w:line="240"/>
+              <w:ind w:left="100" w:right="100" w:firstLine="0" w:firstLineChars="0"/>
+            </w:pPr>
+            <w:r>
+              <w:rPr>
+                <w:rFonts w:ascii="Helvetica" w:hAnsi="Helvetica" w:eastAsia="Helvetica" w:cs="Helvetica"/>
+                <w:i w:val="false"/>
+                <w:b w:val="false"/>
+                <w:u w:val="none"/>
+                <w:sz w:val="22"/>
+                <w:szCs w:val="22"/>
+                <w:color w:val="000000"/>
+              </w:rPr>
+              <w:t xml:space="preserve">0.022</w:t>
+            </w:r>
+          </w:p>
+        </w:tc>
+        <w:tc>
+          <w:tcPr>
+            <w:tcBorders>
+              <w:bottom w:val="none" w:sz="0" w:space="0" w:color="000000"/>
+              <w:top w:val="none" w:sz="0" w:space="0" w:color="000000"/>
+              <w:left w:val="none" w:sz="0" w:space="0" w:color="000000"/>
+              <w:right w:val="none" w:sz="0" w:space="0" w:color="000000"/>
+            </w:tcBorders>
+            <w:shd w:val="clear" w:color="auto" w:fill="FFFFFF"/>
+            <w:tcMar>
+              <w:top w:w="0" w:type="dxa"/>
+              <w:bottom w:w="0" w:type="dxa"/>
+              <w:left w:w="0" w:type="dxa"/>
+              <w:right w:w="0" w:type="dxa"/>
+            </w:tcMar>
+            <w:vAlign w:val="center"/>
+          </w:tcPr>
+          <w:p>
+            <w:pPr>
+              <w:pStyle w:val="Normal"/>
+              <w:jc w:val="right"/>
+              <w:pBdr>
+                <w:bottom w:val="none" w:sz="0" w:space="0" w:color="000000"/>
+                <w:top w:val="none" w:sz="0" w:space="0" w:color="000000"/>
+                <w:left w:val="none" w:sz="0" w:space="0" w:color="000000"/>
+                <w:right w:val="none" w:sz="0" w:space="0" w:color="000000"/>
+              </w:pBdr>
+              <w:spacing w:after="100" w:before="100" w:line="240"/>
+              <w:ind w:left="100" w:right="100" w:firstLine="0" w:firstLineChars="0"/>
+            </w:pPr>
+            <w:r>
+              <w:rPr>
+                <w:rFonts w:ascii="Helvetica" w:hAnsi="Helvetica" w:eastAsia="Helvetica" w:cs="Helvetica"/>
+                <w:i w:val="false"/>
+                <w:b w:val="false"/>
+                <w:u w:val="none"/>
+                <w:sz w:val="22"/>
+                <w:szCs w:val="22"/>
+                <w:color w:val="000000"/>
+              </w:rPr>
               <w:t xml:space="preserve">72</w:t>
             </w:r>
           </w:p>
@@ -6519,6 +8593,50 @@
                 <w:color w:val="000000"/>
               </w:rPr>
               <w:t xml:space="preserve">0.073</w:t>
+            </w:r>
+          </w:p>
+        </w:tc>
+        <w:tc>
+          <w:tcPr>
+            <w:tcBorders>
+              <w:bottom w:val="none" w:sz="0" w:space="0" w:color="000000"/>
+              <w:top w:val="none" w:sz="0" w:space="0" w:color="000000"/>
+              <w:left w:val="none" w:sz="0" w:space="0" w:color="000000"/>
+              <w:right w:val="none" w:sz="0" w:space="0" w:color="000000"/>
+            </w:tcBorders>
+            <w:shd w:val="clear" w:color="auto" w:fill="FFFFFF"/>
+            <w:tcMar>
+              <w:top w:w="0" w:type="dxa"/>
+              <w:bottom w:w="0" w:type="dxa"/>
+              <w:left w:w="0" w:type="dxa"/>
+              <w:right w:w="0" w:type="dxa"/>
+            </w:tcMar>
+            <w:vAlign w:val="center"/>
+          </w:tcPr>
+          <w:p>
+            <w:pPr>
+              <w:pStyle w:val="Normal"/>
+              <w:jc w:val="right"/>
+              <w:pBdr>
+                <w:bottom w:val="none" w:sz="0" w:space="0" w:color="000000"/>
+                <w:top w:val="none" w:sz="0" w:space="0" w:color="000000"/>
+                <w:left w:val="none" w:sz="0" w:space="0" w:color="000000"/>
+                <w:right w:val="none" w:sz="0" w:space="0" w:color="000000"/>
+              </w:pBdr>
+              <w:spacing w:after="100" w:before="100" w:line="240"/>
+              <w:ind w:left="100" w:right="100" w:firstLine="0" w:firstLineChars="0"/>
+            </w:pPr>
+            <w:r>
+              <w:rPr>
+                <w:rFonts w:ascii="Helvetica" w:hAnsi="Helvetica" w:eastAsia="Helvetica" w:cs="Helvetica"/>
+                <w:i w:val="false"/>
+                <w:b w:val="false"/>
+                <w:u w:val="none"/>
+                <w:sz w:val="22"/>
+                <w:szCs w:val="22"/>
+                <w:color w:val="000000"/>
+              </w:rPr>
+              <w:t xml:space="preserve">7.762</w:t>
             </w:r>
           </w:p>
         </w:tc>
@@ -6700,6 +8818,94 @@
                 <w:szCs w:val="22"/>
                 <w:color w:val="000000"/>
               </w:rPr>
+              <w:t xml:space="preserve">-0.380</w:t>
+            </w:r>
+          </w:p>
+        </w:tc>
+        <w:tc>
+          <w:tcPr>
+            <w:tcBorders>
+              <w:bottom w:val="none" w:sz="0" w:space="0" w:color="000000"/>
+              <w:top w:val="none" w:sz="0" w:space="0" w:color="000000"/>
+              <w:left w:val="none" w:sz="0" w:space="0" w:color="000000"/>
+              <w:right w:val="none" w:sz="0" w:space="0" w:color="000000"/>
+            </w:tcBorders>
+            <w:shd w:val="clear" w:color="auto" w:fill="FFFFFF"/>
+            <w:tcMar>
+              <w:top w:w="0" w:type="dxa"/>
+              <w:bottom w:w="0" w:type="dxa"/>
+              <w:left w:w="0" w:type="dxa"/>
+              <w:right w:w="0" w:type="dxa"/>
+            </w:tcMar>
+            <w:vAlign w:val="center"/>
+          </w:tcPr>
+          <w:p>
+            <w:pPr>
+              <w:pStyle w:val="Normal"/>
+              <w:jc w:val="right"/>
+              <w:pBdr>
+                <w:bottom w:val="none" w:sz="0" w:space="0" w:color="000000"/>
+                <w:top w:val="none" w:sz="0" w:space="0" w:color="000000"/>
+                <w:left w:val="none" w:sz="0" w:space="0" w:color="000000"/>
+                <w:right w:val="none" w:sz="0" w:space="0" w:color="000000"/>
+              </w:pBdr>
+              <w:spacing w:after="100" w:before="100" w:line="240"/>
+              <w:ind w:left="100" w:right="100" w:firstLine="0" w:firstLineChars="0"/>
+            </w:pPr>
+            <w:r>
+              <w:rPr>
+                <w:rFonts w:ascii="Helvetica" w:hAnsi="Helvetica" w:eastAsia="Helvetica" w:cs="Helvetica"/>
+                <w:i w:val="false"/>
+                <w:b w:val="false"/>
+                <w:u w:val="none"/>
+                <w:sz w:val="22"/>
+                <w:szCs w:val="22"/>
+                <w:color w:val="000000"/>
+              </w:rPr>
+              <w:t xml:space="preserve">0.020</w:t>
+            </w:r>
+          </w:p>
+        </w:tc>
+        <w:tc>
+          <w:tcPr>
+            <w:tcBorders>
+              <w:bottom w:val="none" w:sz="0" w:space="0" w:color="000000"/>
+              <w:top w:val="none" w:sz="0" w:space="0" w:color="000000"/>
+              <w:left w:val="none" w:sz="0" w:space="0" w:color="000000"/>
+              <w:right w:val="none" w:sz="0" w:space="0" w:color="000000"/>
+            </w:tcBorders>
+            <w:shd w:val="clear" w:color="auto" w:fill="FFFFFF"/>
+            <w:tcMar>
+              <w:top w:w="0" w:type="dxa"/>
+              <w:bottom w:w="0" w:type="dxa"/>
+              <w:left w:w="0" w:type="dxa"/>
+              <w:right w:w="0" w:type="dxa"/>
+            </w:tcMar>
+            <w:vAlign w:val="center"/>
+          </w:tcPr>
+          <w:p>
+            <w:pPr>
+              <w:pStyle w:val="Normal"/>
+              <w:jc w:val="right"/>
+              <w:pBdr>
+                <w:bottom w:val="none" w:sz="0" w:space="0" w:color="000000"/>
+                <w:top w:val="none" w:sz="0" w:space="0" w:color="000000"/>
+                <w:left w:val="none" w:sz="0" w:space="0" w:color="000000"/>
+                <w:right w:val="none" w:sz="0" w:space="0" w:color="000000"/>
+              </w:pBdr>
+              <w:spacing w:after="100" w:before="100" w:line="240"/>
+              <w:ind w:left="100" w:right="100" w:firstLine="0" w:firstLineChars="0"/>
+            </w:pPr>
+            <w:r>
+              <w:rPr>
+                <w:rFonts w:ascii="Helvetica" w:hAnsi="Helvetica" w:eastAsia="Helvetica" w:cs="Helvetica"/>
+                <w:i w:val="false"/>
+                <w:b w:val="false"/>
+                <w:u w:val="none"/>
+                <w:sz w:val="22"/>
+                <w:szCs w:val="22"/>
+                <w:color w:val="000000"/>
+              </w:rPr>
               <w:t xml:space="preserve">72</w:t>
             </w:r>
           </w:p>
@@ -6921,6 +9127,50 @@
                 <w:color w:val="000000"/>
               </w:rPr>
               <w:t xml:space="preserve">0.090</w:t>
+            </w:r>
+          </w:p>
+        </w:tc>
+        <w:tc>
+          <w:tcPr>
+            <w:tcBorders>
+              <w:bottom w:val="none" w:sz="0" w:space="0" w:color="000000"/>
+              <w:top w:val="none" w:sz="0" w:space="0" w:color="000000"/>
+              <w:left w:val="none" w:sz="0" w:space="0" w:color="000000"/>
+              <w:right w:val="none" w:sz="0" w:space="0" w:color="000000"/>
+            </w:tcBorders>
+            <w:shd w:val="clear" w:color="auto" w:fill="FFFFFF"/>
+            <w:tcMar>
+              <w:top w:w="0" w:type="dxa"/>
+              <w:bottom w:w="0" w:type="dxa"/>
+              <w:left w:w="0" w:type="dxa"/>
+              <w:right w:w="0" w:type="dxa"/>
+            </w:tcMar>
+            <w:vAlign w:val="center"/>
+          </w:tcPr>
+          <w:p>
+            <w:pPr>
+              <w:pStyle w:val="Normal"/>
+              <w:jc w:val="right"/>
+              <w:pBdr>
+                <w:bottom w:val="none" w:sz="0" w:space="0" w:color="000000"/>
+                <w:top w:val="none" w:sz="0" w:space="0" w:color="000000"/>
+                <w:left w:val="none" w:sz="0" w:space="0" w:color="000000"/>
+                <w:right w:val="none" w:sz="0" w:space="0" w:color="000000"/>
+              </w:pBdr>
+              <w:spacing w:after="100" w:before="100" w:line="240"/>
+              <w:ind w:left="100" w:right="100" w:firstLine="0" w:firstLineChars="0"/>
+            </w:pPr>
+            <w:r>
+              <w:rPr>
+                <w:rFonts w:ascii="Helvetica" w:hAnsi="Helvetica" w:eastAsia="Helvetica" w:cs="Helvetica"/>
+                <w:i w:val="false"/>
+                <w:b w:val="false"/>
+                <w:u w:val="none"/>
+                <w:sz w:val="22"/>
+                <w:szCs w:val="22"/>
+                <w:color w:val="000000"/>
+              </w:rPr>
+              <w:t xml:space="preserve">44.958</w:t>
             </w:r>
           </w:p>
         </w:tc>
@@ -7102,6 +9352,94 @@
                 <w:szCs w:val="22"/>
                 <w:color w:val="000000"/>
               </w:rPr>
+              <w:t xml:space="preserve">-0.065</w:t>
+            </w:r>
+          </w:p>
+        </w:tc>
+        <w:tc>
+          <w:tcPr>
+            <w:tcBorders>
+              <w:bottom w:val="none" w:sz="0" w:space="0" w:color="000000"/>
+              <w:top w:val="none" w:sz="0" w:space="0" w:color="000000"/>
+              <w:left w:val="none" w:sz="0" w:space="0" w:color="000000"/>
+              <w:right w:val="none" w:sz="0" w:space="0" w:color="000000"/>
+            </w:tcBorders>
+            <w:shd w:val="clear" w:color="auto" w:fill="FFFFFF"/>
+            <w:tcMar>
+              <w:top w:w="0" w:type="dxa"/>
+              <w:bottom w:w="0" w:type="dxa"/>
+              <w:left w:w="0" w:type="dxa"/>
+              <w:right w:w="0" w:type="dxa"/>
+            </w:tcMar>
+            <w:vAlign w:val="center"/>
+          </w:tcPr>
+          <w:p>
+            <w:pPr>
+              <w:pStyle w:val="Normal"/>
+              <w:jc w:val="right"/>
+              <w:pBdr>
+                <w:bottom w:val="none" w:sz="0" w:space="0" w:color="000000"/>
+                <w:top w:val="none" w:sz="0" w:space="0" w:color="000000"/>
+                <w:left w:val="none" w:sz="0" w:space="0" w:color="000000"/>
+                <w:right w:val="none" w:sz="0" w:space="0" w:color="000000"/>
+              </w:pBdr>
+              <w:spacing w:after="100" w:before="100" w:line="240"/>
+              <w:ind w:left="100" w:right="100" w:firstLine="0" w:firstLineChars="0"/>
+            </w:pPr>
+            <w:r>
+              <w:rPr>
+                <w:rFonts w:ascii="Helvetica" w:hAnsi="Helvetica" w:eastAsia="Helvetica" w:cs="Helvetica"/>
+                <w:i w:val="false"/>
+                <w:b w:val="false"/>
+                <w:u w:val="none"/>
+                <w:sz w:val="22"/>
+                <w:szCs w:val="22"/>
+                <w:color w:val="000000"/>
+              </w:rPr>
+              <w:t xml:space="preserve">0.015</w:t>
+            </w:r>
+          </w:p>
+        </w:tc>
+        <w:tc>
+          <w:tcPr>
+            <w:tcBorders>
+              <w:bottom w:val="none" w:sz="0" w:space="0" w:color="000000"/>
+              <w:top w:val="none" w:sz="0" w:space="0" w:color="000000"/>
+              <w:left w:val="none" w:sz="0" w:space="0" w:color="000000"/>
+              <w:right w:val="none" w:sz="0" w:space="0" w:color="000000"/>
+            </w:tcBorders>
+            <w:shd w:val="clear" w:color="auto" w:fill="FFFFFF"/>
+            <w:tcMar>
+              <w:top w:w="0" w:type="dxa"/>
+              <w:bottom w:w="0" w:type="dxa"/>
+              <w:left w:w="0" w:type="dxa"/>
+              <w:right w:w="0" w:type="dxa"/>
+            </w:tcMar>
+            <w:vAlign w:val="center"/>
+          </w:tcPr>
+          <w:p>
+            <w:pPr>
+              <w:pStyle w:val="Normal"/>
+              <w:jc w:val="right"/>
+              <w:pBdr>
+                <w:bottom w:val="none" w:sz="0" w:space="0" w:color="000000"/>
+                <w:top w:val="none" w:sz="0" w:space="0" w:color="000000"/>
+                <w:left w:val="none" w:sz="0" w:space="0" w:color="000000"/>
+                <w:right w:val="none" w:sz="0" w:space="0" w:color="000000"/>
+              </w:pBdr>
+              <w:spacing w:after="100" w:before="100" w:line="240"/>
+              <w:ind w:left="100" w:right="100" w:firstLine="0" w:firstLineChars="0"/>
+            </w:pPr>
+            <w:r>
+              <w:rPr>
+                <w:rFonts w:ascii="Helvetica" w:hAnsi="Helvetica" w:eastAsia="Helvetica" w:cs="Helvetica"/>
+                <w:i w:val="false"/>
+                <w:b w:val="false"/>
+                <w:u w:val="none"/>
+                <w:sz w:val="22"/>
+                <w:szCs w:val="22"/>
+                <w:color w:val="000000"/>
+              </w:rPr>
               <w:t xml:space="preserve">72</w:t>
             </w:r>
           </w:p>
@@ -7323,6 +9661,50 @@
                 <w:color w:val="000000"/>
               </w:rPr>
               <w:t xml:space="preserve">0.071</w:t>
+            </w:r>
+          </w:p>
+        </w:tc>
+        <w:tc>
+          <w:tcPr>
+            <w:tcBorders>
+              <w:bottom w:val="none" w:sz="0" w:space="0" w:color="000000"/>
+              <w:top w:val="none" w:sz="0" w:space="0" w:color="000000"/>
+              <w:left w:val="none" w:sz="0" w:space="0" w:color="000000"/>
+              <w:right w:val="none" w:sz="0" w:space="0" w:color="000000"/>
+            </w:tcBorders>
+            <w:shd w:val="clear" w:color="auto" w:fill="FFFFFF"/>
+            <w:tcMar>
+              <w:top w:w="0" w:type="dxa"/>
+              <w:bottom w:w="0" w:type="dxa"/>
+              <w:left w:w="0" w:type="dxa"/>
+              <w:right w:w="0" w:type="dxa"/>
+            </w:tcMar>
+            <w:vAlign w:val="center"/>
+          </w:tcPr>
+          <w:p>
+            <w:pPr>
+              <w:pStyle w:val="Normal"/>
+              <w:jc w:val="right"/>
+              <w:pBdr>
+                <w:bottom w:val="none" w:sz="0" w:space="0" w:color="000000"/>
+                <w:top w:val="none" w:sz="0" w:space="0" w:color="000000"/>
+                <w:left w:val="none" w:sz="0" w:space="0" w:color="000000"/>
+                <w:right w:val="none" w:sz="0" w:space="0" w:color="000000"/>
+              </w:pBdr>
+              <w:spacing w:after="100" w:before="100" w:line="240"/>
+              <w:ind w:left="100" w:right="100" w:firstLine="0" w:firstLineChars="0"/>
+            </w:pPr>
+            <w:r>
+              <w:rPr>
+                <w:rFonts w:ascii="Helvetica" w:hAnsi="Helvetica" w:eastAsia="Helvetica" w:cs="Helvetica"/>
+                <w:i w:val="false"/>
+                <w:b w:val="false"/>
+                <w:u w:val="none"/>
+                <w:sz w:val="22"/>
+                <w:szCs w:val="22"/>
+                <w:color w:val="000000"/>
+              </w:rPr>
+              <w:t xml:space="preserve">-15.486</w:t>
             </w:r>
           </w:p>
         </w:tc>
@@ -7504,6 +9886,94 @@
                 <w:szCs w:val="22"/>
                 <w:color w:val="000000"/>
               </w:rPr>
+              <w:t xml:space="preserve">-0.493</w:t>
+            </w:r>
+          </w:p>
+        </w:tc>
+        <w:tc>
+          <w:tcPr>
+            <w:tcBorders>
+              <w:bottom w:val="none" w:sz="0" w:space="0" w:color="000000"/>
+              <w:top w:val="none" w:sz="0" w:space="0" w:color="000000"/>
+              <w:left w:val="none" w:sz="0" w:space="0" w:color="000000"/>
+              <w:right w:val="none" w:sz="0" w:space="0" w:color="000000"/>
+            </w:tcBorders>
+            <w:shd w:val="clear" w:color="auto" w:fill="FFFFFF"/>
+            <w:tcMar>
+              <w:top w:w="0" w:type="dxa"/>
+              <w:bottom w:w="0" w:type="dxa"/>
+              <w:left w:w="0" w:type="dxa"/>
+              <w:right w:w="0" w:type="dxa"/>
+            </w:tcMar>
+            <w:vAlign w:val="center"/>
+          </w:tcPr>
+          <w:p>
+            <w:pPr>
+              <w:pStyle w:val="Normal"/>
+              <w:jc w:val="right"/>
+              <w:pBdr>
+                <w:bottom w:val="none" w:sz="0" w:space="0" w:color="000000"/>
+                <w:top w:val="none" w:sz="0" w:space="0" w:color="000000"/>
+                <w:left w:val="none" w:sz="0" w:space="0" w:color="000000"/>
+                <w:right w:val="none" w:sz="0" w:space="0" w:color="000000"/>
+              </w:pBdr>
+              <w:spacing w:after="100" w:before="100" w:line="240"/>
+              <w:ind w:left="100" w:right="100" w:firstLine="0" w:firstLineChars="0"/>
+            </w:pPr>
+            <w:r>
+              <w:rPr>
+                <w:rFonts w:ascii="Helvetica" w:hAnsi="Helvetica" w:eastAsia="Helvetica" w:cs="Helvetica"/>
+                <w:i w:val="false"/>
+                <w:b w:val="false"/>
+                <w:u w:val="none"/>
+                <w:sz w:val="22"/>
+                <w:szCs w:val="22"/>
+                <w:color w:val="000000"/>
+              </w:rPr>
+              <w:t xml:space="preserve">0.032</w:t>
+            </w:r>
+          </w:p>
+        </w:tc>
+        <w:tc>
+          <w:tcPr>
+            <w:tcBorders>
+              <w:bottom w:val="none" w:sz="0" w:space="0" w:color="000000"/>
+              <w:top w:val="none" w:sz="0" w:space="0" w:color="000000"/>
+              <w:left w:val="none" w:sz="0" w:space="0" w:color="000000"/>
+              <w:right w:val="none" w:sz="0" w:space="0" w:color="000000"/>
+            </w:tcBorders>
+            <w:shd w:val="clear" w:color="auto" w:fill="FFFFFF"/>
+            <w:tcMar>
+              <w:top w:w="0" w:type="dxa"/>
+              <w:bottom w:w="0" w:type="dxa"/>
+              <w:left w:w="0" w:type="dxa"/>
+              <w:right w:w="0" w:type="dxa"/>
+            </w:tcMar>
+            <w:vAlign w:val="center"/>
+          </w:tcPr>
+          <w:p>
+            <w:pPr>
+              <w:pStyle w:val="Normal"/>
+              <w:jc w:val="right"/>
+              <w:pBdr>
+                <w:bottom w:val="none" w:sz="0" w:space="0" w:color="000000"/>
+                <w:top w:val="none" w:sz="0" w:space="0" w:color="000000"/>
+                <w:left w:val="none" w:sz="0" w:space="0" w:color="000000"/>
+                <w:right w:val="none" w:sz="0" w:space="0" w:color="000000"/>
+              </w:pBdr>
+              <w:spacing w:after="100" w:before="100" w:line="240"/>
+              <w:ind w:left="100" w:right="100" w:firstLine="0" w:firstLineChars="0"/>
+            </w:pPr>
+            <w:r>
+              <w:rPr>
+                <w:rFonts w:ascii="Helvetica" w:hAnsi="Helvetica" w:eastAsia="Helvetica" w:cs="Helvetica"/>
+                <w:i w:val="false"/>
+                <w:b w:val="false"/>
+                <w:u w:val="none"/>
+                <w:sz w:val="22"/>
+                <w:szCs w:val="22"/>
+                <w:color w:val="000000"/>
+              </w:rPr>
               <w:t xml:space="preserve">72</w:t>
             </w:r>
           </w:p>
@@ -7725,6 +10195,50 @@
                 <w:color w:val="000000"/>
               </w:rPr>
               <w:t xml:space="preserve">0.126</w:t>
+            </w:r>
+          </w:p>
+        </w:tc>
+        <w:tc>
+          <w:tcPr>
+            <w:tcBorders>
+              <w:bottom w:val="none" w:sz="0" w:space="0" w:color="000000"/>
+              <w:top w:val="none" w:sz="0" w:space="0" w:color="000000"/>
+              <w:left w:val="none" w:sz="0" w:space="0" w:color="000000"/>
+              <w:right w:val="none" w:sz="0" w:space="0" w:color="000000"/>
+            </w:tcBorders>
+            <w:shd w:val="clear" w:color="auto" w:fill="FFFFFF"/>
+            <w:tcMar>
+              <w:top w:w="0" w:type="dxa"/>
+              <w:bottom w:w="0" w:type="dxa"/>
+              <w:left w:w="0" w:type="dxa"/>
+              <w:right w:w="0" w:type="dxa"/>
+            </w:tcMar>
+            <w:vAlign w:val="center"/>
+          </w:tcPr>
+          <w:p>
+            <w:pPr>
+              <w:pStyle w:val="Normal"/>
+              <w:jc w:val="right"/>
+              <w:pBdr>
+                <w:bottom w:val="none" w:sz="0" w:space="0" w:color="000000"/>
+                <w:top w:val="none" w:sz="0" w:space="0" w:color="000000"/>
+                <w:left w:val="none" w:sz="0" w:space="0" w:color="000000"/>
+                <w:right w:val="none" w:sz="0" w:space="0" w:color="000000"/>
+              </w:pBdr>
+              <w:spacing w:after="100" w:before="100" w:line="240"/>
+              <w:ind w:left="100" w:right="100" w:firstLine="0" w:firstLineChars="0"/>
+            </w:pPr>
+            <w:r>
+              <w:rPr>
+                <w:rFonts w:ascii="Helvetica" w:hAnsi="Helvetica" w:eastAsia="Helvetica" w:cs="Helvetica"/>
+                <w:i w:val="false"/>
+                <w:b w:val="false"/>
+                <w:u w:val="none"/>
+                <w:sz w:val="22"/>
+                <w:szCs w:val="22"/>
+                <w:color w:val="000000"/>
+              </w:rPr>
+              <w:t xml:space="preserve">-38.204</w:t>
             </w:r>
           </w:p>
         </w:tc>
@@ -7906,6 +10420,94 @@
                 <w:szCs w:val="22"/>
                 <w:color w:val="000000"/>
               </w:rPr>
+              <w:t xml:space="preserve">-0.150</w:t>
+            </w:r>
+          </w:p>
+        </w:tc>
+        <w:tc>
+          <w:tcPr>
+            <w:tcBorders>
+              <w:bottom w:val="none" w:sz="0" w:space="0" w:color="000000"/>
+              <w:top w:val="none" w:sz="0" w:space="0" w:color="000000"/>
+              <w:left w:val="none" w:sz="0" w:space="0" w:color="000000"/>
+              <w:right w:val="none" w:sz="0" w:space="0" w:color="000000"/>
+            </w:tcBorders>
+            <w:shd w:val="clear" w:color="auto" w:fill="FFFFFF"/>
+            <w:tcMar>
+              <w:top w:w="0" w:type="dxa"/>
+              <w:bottom w:w="0" w:type="dxa"/>
+              <w:left w:w="0" w:type="dxa"/>
+              <w:right w:w="0" w:type="dxa"/>
+            </w:tcMar>
+            <w:vAlign w:val="center"/>
+          </w:tcPr>
+          <w:p>
+            <w:pPr>
+              <w:pStyle w:val="Normal"/>
+              <w:jc w:val="right"/>
+              <w:pBdr>
+                <w:bottom w:val="none" w:sz="0" w:space="0" w:color="000000"/>
+                <w:top w:val="none" w:sz="0" w:space="0" w:color="000000"/>
+                <w:left w:val="none" w:sz="0" w:space="0" w:color="000000"/>
+                <w:right w:val="none" w:sz="0" w:space="0" w:color="000000"/>
+              </w:pBdr>
+              <w:spacing w:after="100" w:before="100" w:line="240"/>
+              <w:ind w:left="100" w:right="100" w:firstLine="0" w:firstLineChars="0"/>
+            </w:pPr>
+            <w:r>
+              <w:rPr>
+                <w:rFonts w:ascii="Helvetica" w:hAnsi="Helvetica" w:eastAsia="Helvetica" w:cs="Helvetica"/>
+                <w:i w:val="false"/>
+                <w:b w:val="false"/>
+                <w:u w:val="none"/>
+                <w:sz w:val="22"/>
+                <w:szCs w:val="22"/>
+                <w:color w:val="000000"/>
+              </w:rPr>
+              <w:t xml:space="preserve">0.030</w:t>
+            </w:r>
+          </w:p>
+        </w:tc>
+        <w:tc>
+          <w:tcPr>
+            <w:tcBorders>
+              <w:bottom w:val="none" w:sz="0" w:space="0" w:color="000000"/>
+              <w:top w:val="none" w:sz="0" w:space="0" w:color="000000"/>
+              <w:left w:val="none" w:sz="0" w:space="0" w:color="000000"/>
+              <w:right w:val="none" w:sz="0" w:space="0" w:color="000000"/>
+            </w:tcBorders>
+            <w:shd w:val="clear" w:color="auto" w:fill="FFFFFF"/>
+            <w:tcMar>
+              <w:top w:w="0" w:type="dxa"/>
+              <w:bottom w:w="0" w:type="dxa"/>
+              <w:left w:w="0" w:type="dxa"/>
+              <w:right w:w="0" w:type="dxa"/>
+            </w:tcMar>
+            <w:vAlign w:val="center"/>
+          </w:tcPr>
+          <w:p>
+            <w:pPr>
+              <w:pStyle w:val="Normal"/>
+              <w:jc w:val="right"/>
+              <w:pBdr>
+                <w:bottom w:val="none" w:sz="0" w:space="0" w:color="000000"/>
+                <w:top w:val="none" w:sz="0" w:space="0" w:color="000000"/>
+                <w:left w:val="none" w:sz="0" w:space="0" w:color="000000"/>
+                <w:right w:val="none" w:sz="0" w:space="0" w:color="000000"/>
+              </w:pBdr>
+              <w:spacing w:after="100" w:before="100" w:line="240"/>
+              <w:ind w:left="100" w:right="100" w:firstLine="0" w:firstLineChars="0"/>
+            </w:pPr>
+            <w:r>
+              <w:rPr>
+                <w:rFonts w:ascii="Helvetica" w:hAnsi="Helvetica" w:eastAsia="Helvetica" w:cs="Helvetica"/>
+                <w:i w:val="false"/>
+                <w:b w:val="false"/>
+                <w:u w:val="none"/>
+                <w:sz w:val="22"/>
+                <w:szCs w:val="22"/>
+                <w:color w:val="000000"/>
+              </w:rPr>
               <w:t xml:space="preserve">72</w:t>
             </w:r>
           </w:p>
@@ -8127,6 +10729,50 @@
                 <w:color w:val="000000"/>
               </w:rPr>
               <w:t xml:space="preserve">0.128</w:t>
+            </w:r>
+          </w:p>
+        </w:tc>
+        <w:tc>
+          <w:tcPr>
+            <w:tcBorders>
+              <w:bottom w:val="none" w:sz="0" w:space="0" w:color="000000"/>
+              <w:top w:val="none" w:sz="0" w:space="0" w:color="000000"/>
+              <w:left w:val="none" w:sz="0" w:space="0" w:color="000000"/>
+              <w:right w:val="none" w:sz="0" w:space="0" w:color="000000"/>
+            </w:tcBorders>
+            <w:shd w:val="clear" w:color="auto" w:fill="FFFFFF"/>
+            <w:tcMar>
+              <w:top w:w="0" w:type="dxa"/>
+              <w:bottom w:w="0" w:type="dxa"/>
+              <w:left w:w="0" w:type="dxa"/>
+              <w:right w:w="0" w:type="dxa"/>
+            </w:tcMar>
+            <w:vAlign w:val="center"/>
+          </w:tcPr>
+          <w:p>
+            <w:pPr>
+              <w:pStyle w:val="Normal"/>
+              <w:jc w:val="right"/>
+              <w:pBdr>
+                <w:bottom w:val="none" w:sz="0" w:space="0" w:color="000000"/>
+                <w:top w:val="none" w:sz="0" w:space="0" w:color="000000"/>
+                <w:left w:val="none" w:sz="0" w:space="0" w:color="000000"/>
+                <w:right w:val="none" w:sz="0" w:space="0" w:color="000000"/>
+              </w:pBdr>
+              <w:spacing w:after="100" w:before="100" w:line="240"/>
+              <w:ind w:left="100" w:right="100" w:firstLine="0" w:firstLineChars="0"/>
+            </w:pPr>
+            <w:r>
+              <w:rPr>
+                <w:rFonts w:ascii="Helvetica" w:hAnsi="Helvetica" w:eastAsia="Helvetica" w:cs="Helvetica"/>
+                <w:i w:val="false"/>
+                <w:b w:val="false"/>
+                <w:u w:val="none"/>
+                <w:sz w:val="22"/>
+                <w:szCs w:val="22"/>
+                <w:color w:val="000000"/>
+              </w:rPr>
+              <w:t xml:space="preserve">-18.203</w:t>
             </w:r>
           </w:p>
         </w:tc>
@@ -8308,6 +10954,94 @@
                 <w:szCs w:val="22"/>
                 <w:color w:val="000000"/>
               </w:rPr>
+              <w:t xml:space="preserve">0.093</w:t>
+            </w:r>
+          </w:p>
+        </w:tc>
+        <w:tc>
+          <w:tcPr>
+            <w:tcBorders>
+              <w:bottom w:val="none" w:sz="0" w:space="0" w:color="000000"/>
+              <w:top w:val="none" w:sz="0" w:space="0" w:color="000000"/>
+              <w:left w:val="none" w:sz="0" w:space="0" w:color="000000"/>
+              <w:right w:val="none" w:sz="0" w:space="0" w:color="000000"/>
+            </w:tcBorders>
+            <w:shd w:val="clear" w:color="auto" w:fill="FFFFFF"/>
+            <w:tcMar>
+              <w:top w:w="0" w:type="dxa"/>
+              <w:bottom w:w="0" w:type="dxa"/>
+              <w:left w:w="0" w:type="dxa"/>
+              <w:right w:w="0" w:type="dxa"/>
+            </w:tcMar>
+            <w:vAlign w:val="center"/>
+          </w:tcPr>
+          <w:p>
+            <w:pPr>
+              <w:pStyle w:val="Normal"/>
+              <w:jc w:val="right"/>
+              <w:pBdr>
+                <w:bottom w:val="none" w:sz="0" w:space="0" w:color="000000"/>
+                <w:top w:val="none" w:sz="0" w:space="0" w:color="000000"/>
+                <w:left w:val="none" w:sz="0" w:space="0" w:color="000000"/>
+                <w:right w:val="none" w:sz="0" w:space="0" w:color="000000"/>
+              </w:pBdr>
+              <w:spacing w:after="100" w:before="100" w:line="240"/>
+              <w:ind w:left="100" w:right="100" w:firstLine="0" w:firstLineChars="0"/>
+            </w:pPr>
+            <w:r>
+              <w:rPr>
+                <w:rFonts w:ascii="Helvetica" w:hAnsi="Helvetica" w:eastAsia="Helvetica" w:cs="Helvetica"/>
+                <w:i w:val="false"/>
+                <w:b w:val="false"/>
+                <w:u w:val="none"/>
+                <w:sz w:val="22"/>
+                <w:szCs w:val="22"/>
+                <w:color w:val="000000"/>
+              </w:rPr>
+              <w:t xml:space="preserve">0.018</w:t>
+            </w:r>
+          </w:p>
+        </w:tc>
+        <w:tc>
+          <w:tcPr>
+            <w:tcBorders>
+              <w:bottom w:val="none" w:sz="0" w:space="0" w:color="000000"/>
+              <w:top w:val="none" w:sz="0" w:space="0" w:color="000000"/>
+              <w:left w:val="none" w:sz="0" w:space="0" w:color="000000"/>
+              <w:right w:val="none" w:sz="0" w:space="0" w:color="000000"/>
+            </w:tcBorders>
+            <w:shd w:val="clear" w:color="auto" w:fill="FFFFFF"/>
+            <w:tcMar>
+              <w:top w:w="0" w:type="dxa"/>
+              <w:bottom w:w="0" w:type="dxa"/>
+              <w:left w:w="0" w:type="dxa"/>
+              <w:right w:w="0" w:type="dxa"/>
+            </w:tcMar>
+            <w:vAlign w:val="center"/>
+          </w:tcPr>
+          <w:p>
+            <w:pPr>
+              <w:pStyle w:val="Normal"/>
+              <w:jc w:val="right"/>
+              <w:pBdr>
+                <w:bottom w:val="none" w:sz="0" w:space="0" w:color="000000"/>
+                <w:top w:val="none" w:sz="0" w:space="0" w:color="000000"/>
+                <w:left w:val="none" w:sz="0" w:space="0" w:color="000000"/>
+                <w:right w:val="none" w:sz="0" w:space="0" w:color="000000"/>
+              </w:pBdr>
+              <w:spacing w:after="100" w:before="100" w:line="240"/>
+              <w:ind w:left="100" w:right="100" w:firstLine="0" w:firstLineChars="0"/>
+            </w:pPr>
+            <w:r>
+              <w:rPr>
+                <w:rFonts w:ascii="Helvetica" w:hAnsi="Helvetica" w:eastAsia="Helvetica" w:cs="Helvetica"/>
+                <w:i w:val="false"/>
+                <w:b w:val="false"/>
+                <w:u w:val="none"/>
+                <w:sz w:val="22"/>
+                <w:szCs w:val="22"/>
+                <w:color w:val="000000"/>
+              </w:rPr>
               <w:t xml:space="preserve">72</w:t>
             </w:r>
           </w:p>
@@ -8529,6 +11263,50 @@
                 <w:color w:val="000000"/>
               </w:rPr>
               <w:t xml:space="preserve">0.054</w:t>
+            </w:r>
+          </w:p>
+        </w:tc>
+        <w:tc>
+          <w:tcPr>
+            <w:tcBorders>
+              <w:bottom w:val="none" w:sz="0" w:space="0" w:color="000000"/>
+              <w:top w:val="none" w:sz="0" w:space="0" w:color="000000"/>
+              <w:left w:val="none" w:sz="0" w:space="0" w:color="000000"/>
+              <w:right w:val="none" w:sz="0" w:space="0" w:color="000000"/>
+            </w:tcBorders>
+            <w:shd w:val="clear" w:color="auto" w:fill="FFFFFF"/>
+            <w:tcMar>
+              <w:top w:w="0" w:type="dxa"/>
+              <w:bottom w:w="0" w:type="dxa"/>
+              <w:left w:w="0" w:type="dxa"/>
+              <w:right w:w="0" w:type="dxa"/>
+            </w:tcMar>
+            <w:vAlign w:val="center"/>
+          </w:tcPr>
+          <w:p>
+            <w:pPr>
+              <w:pStyle w:val="Normal"/>
+              <w:jc w:val="right"/>
+              <w:pBdr>
+                <w:bottom w:val="none" w:sz="0" w:space="0" w:color="000000"/>
+                <w:top w:val="none" w:sz="0" w:space="0" w:color="000000"/>
+                <w:left w:val="none" w:sz="0" w:space="0" w:color="000000"/>
+                <w:right w:val="none" w:sz="0" w:space="0" w:color="000000"/>
+              </w:pBdr>
+              <w:spacing w:after="100" w:before="100" w:line="240"/>
+              <w:ind w:left="100" w:right="100" w:firstLine="0" w:firstLineChars="0"/>
+            </w:pPr>
+            <w:r>
+              <w:rPr>
+                <w:rFonts w:ascii="Helvetica" w:hAnsi="Helvetica" w:eastAsia="Helvetica" w:cs="Helvetica"/>
+                <w:i w:val="false"/>
+                <w:b w:val="false"/>
+                <w:u w:val="none"/>
+                <w:sz w:val="22"/>
+                <w:szCs w:val="22"/>
+                <w:color w:val="000000"/>
+              </w:rPr>
+              <w:t xml:space="preserve">Inf</w:t>
             </w:r>
           </w:p>
         </w:tc>
@@ -8710,6 +11488,94 @@
                 <w:szCs w:val="22"/>
                 <w:color w:val="000000"/>
               </w:rPr>
+              <w:t xml:space="preserve">0.152</w:t>
+            </w:r>
+          </w:p>
+        </w:tc>
+        <w:tc>
+          <w:tcPr>
+            <w:tcBorders>
+              <w:bottom w:val="none" w:sz="0" w:space="0" w:color="000000"/>
+              <w:top w:val="none" w:sz="0" w:space="0" w:color="000000"/>
+              <w:left w:val="none" w:sz="0" w:space="0" w:color="000000"/>
+              <w:right w:val="none" w:sz="0" w:space="0" w:color="000000"/>
+            </w:tcBorders>
+            <w:shd w:val="clear" w:color="auto" w:fill="FFFFFF"/>
+            <w:tcMar>
+              <w:top w:w="0" w:type="dxa"/>
+              <w:bottom w:w="0" w:type="dxa"/>
+              <w:left w:w="0" w:type="dxa"/>
+              <w:right w:w="0" w:type="dxa"/>
+            </w:tcMar>
+            <w:vAlign w:val="center"/>
+          </w:tcPr>
+          <w:p>
+            <w:pPr>
+              <w:pStyle w:val="Normal"/>
+              <w:jc w:val="right"/>
+              <w:pBdr>
+                <w:bottom w:val="none" w:sz="0" w:space="0" w:color="000000"/>
+                <w:top w:val="none" w:sz="0" w:space="0" w:color="000000"/>
+                <w:left w:val="none" w:sz="0" w:space="0" w:color="000000"/>
+                <w:right w:val="none" w:sz="0" w:space="0" w:color="000000"/>
+              </w:pBdr>
+              <w:spacing w:after="100" w:before="100" w:line="240"/>
+              <w:ind w:left="100" w:right="100" w:firstLine="0" w:firstLineChars="0"/>
+            </w:pPr>
+            <w:r>
+              <w:rPr>
+                <w:rFonts w:ascii="Helvetica" w:hAnsi="Helvetica" w:eastAsia="Helvetica" w:cs="Helvetica"/>
+                <w:i w:val="false"/>
+                <w:b w:val="false"/>
+                <w:u w:val="none"/>
+                <w:sz w:val="22"/>
+                <w:szCs w:val="22"/>
+                <w:color w:val="000000"/>
+              </w:rPr>
+              <w:t xml:space="preserve">0.020</w:t>
+            </w:r>
+          </w:p>
+        </w:tc>
+        <w:tc>
+          <w:tcPr>
+            <w:tcBorders>
+              <w:bottom w:val="none" w:sz="0" w:space="0" w:color="000000"/>
+              <w:top w:val="none" w:sz="0" w:space="0" w:color="000000"/>
+              <w:left w:val="none" w:sz="0" w:space="0" w:color="000000"/>
+              <w:right w:val="none" w:sz="0" w:space="0" w:color="000000"/>
+            </w:tcBorders>
+            <w:shd w:val="clear" w:color="auto" w:fill="FFFFFF"/>
+            <w:tcMar>
+              <w:top w:w="0" w:type="dxa"/>
+              <w:bottom w:w="0" w:type="dxa"/>
+              <w:left w:w="0" w:type="dxa"/>
+              <w:right w:w="0" w:type="dxa"/>
+            </w:tcMar>
+            <w:vAlign w:val="center"/>
+          </w:tcPr>
+          <w:p>
+            <w:pPr>
+              <w:pStyle w:val="Normal"/>
+              <w:jc w:val="right"/>
+              <w:pBdr>
+                <w:bottom w:val="none" w:sz="0" w:space="0" w:color="000000"/>
+                <w:top w:val="none" w:sz="0" w:space="0" w:color="000000"/>
+                <w:left w:val="none" w:sz="0" w:space="0" w:color="000000"/>
+                <w:right w:val="none" w:sz="0" w:space="0" w:color="000000"/>
+              </w:pBdr>
+              <w:spacing w:after="100" w:before="100" w:line="240"/>
+              <w:ind w:left="100" w:right="100" w:firstLine="0" w:firstLineChars="0"/>
+            </w:pPr>
+            <w:r>
+              <w:rPr>
+                <w:rFonts w:ascii="Helvetica" w:hAnsi="Helvetica" w:eastAsia="Helvetica" w:cs="Helvetica"/>
+                <w:i w:val="false"/>
+                <w:b w:val="false"/>
+                <w:u w:val="none"/>
+                <w:sz w:val="22"/>
+                <w:szCs w:val="22"/>
+                <w:color w:val="000000"/>
+              </w:rPr>
               <w:t xml:space="preserve">72</w:t>
             </w:r>
           </w:p>
@@ -8931,6 +11797,50 @@
                 <w:color w:val="000000"/>
               </w:rPr>
               <w:t xml:space="preserve">0.091</w:t>
+            </w:r>
+          </w:p>
+        </w:tc>
+        <w:tc>
+          <w:tcPr>
+            <w:tcBorders>
+              <w:bottom w:val="none" w:sz="0" w:space="0" w:color="000000"/>
+              <w:top w:val="none" w:sz="0" w:space="0" w:color="000000"/>
+              <w:left w:val="none" w:sz="0" w:space="0" w:color="000000"/>
+              <w:right w:val="none" w:sz="0" w:space="0" w:color="000000"/>
+            </w:tcBorders>
+            <w:shd w:val="clear" w:color="auto" w:fill="FFFFFF"/>
+            <w:tcMar>
+              <w:top w:w="0" w:type="dxa"/>
+              <w:bottom w:w="0" w:type="dxa"/>
+              <w:left w:w="0" w:type="dxa"/>
+              <w:right w:w="0" w:type="dxa"/>
+            </w:tcMar>
+            <w:vAlign w:val="center"/>
+          </w:tcPr>
+          <w:p>
+            <w:pPr>
+              <w:pStyle w:val="Normal"/>
+              <w:jc w:val="right"/>
+              <w:pBdr>
+                <w:bottom w:val="none" w:sz="0" w:space="0" w:color="000000"/>
+                <w:top w:val="none" w:sz="0" w:space="0" w:color="000000"/>
+                <w:left w:val="none" w:sz="0" w:space="0" w:color="000000"/>
+                <w:right w:val="none" w:sz="0" w:space="0" w:color="000000"/>
+              </w:pBdr>
+              <w:spacing w:after="100" w:before="100" w:line="240"/>
+              <w:ind w:left="100" w:right="100" w:firstLine="0" w:firstLineChars="0"/>
+            </w:pPr>
+            <w:r>
+              <w:rPr>
+                <w:rFonts w:ascii="Helvetica" w:hAnsi="Helvetica" w:eastAsia="Helvetica" w:cs="Helvetica"/>
+                <w:i w:val="false"/>
+                <w:b w:val="false"/>
+                <w:u w:val="none"/>
+                <w:sz w:val="22"/>
+                <w:szCs w:val="22"/>
+                <w:color w:val="000000"/>
+              </w:rPr>
+              <w:t xml:space="preserve">Inf</w:t>
             </w:r>
           </w:p>
         </w:tc>
@@ -9112,6 +12022,94 @@
                 <w:szCs w:val="22"/>
                 <w:color w:val="000000"/>
               </w:rPr>
+              <w:t xml:space="preserve">-0.238</w:t>
+            </w:r>
+          </w:p>
+        </w:tc>
+        <w:tc>
+          <w:tcPr>
+            <w:tcBorders>
+              <w:bottom w:val="none" w:sz="0" w:space="0" w:color="000000"/>
+              <w:top w:val="none" w:sz="0" w:space="0" w:color="000000"/>
+              <w:left w:val="none" w:sz="0" w:space="0" w:color="000000"/>
+              <w:right w:val="none" w:sz="0" w:space="0" w:color="000000"/>
+            </w:tcBorders>
+            <w:shd w:val="clear" w:color="auto" w:fill="FFFFFF"/>
+            <w:tcMar>
+              <w:top w:w="0" w:type="dxa"/>
+              <w:bottom w:w="0" w:type="dxa"/>
+              <w:left w:w="0" w:type="dxa"/>
+              <w:right w:w="0" w:type="dxa"/>
+            </w:tcMar>
+            <w:vAlign w:val="center"/>
+          </w:tcPr>
+          <w:p>
+            <w:pPr>
+              <w:pStyle w:val="Normal"/>
+              <w:jc w:val="right"/>
+              <w:pBdr>
+                <w:bottom w:val="none" w:sz="0" w:space="0" w:color="000000"/>
+                <w:top w:val="none" w:sz="0" w:space="0" w:color="000000"/>
+                <w:left w:val="none" w:sz="0" w:space="0" w:color="000000"/>
+                <w:right w:val="none" w:sz="0" w:space="0" w:color="000000"/>
+              </w:pBdr>
+              <w:spacing w:after="100" w:before="100" w:line="240"/>
+              <w:ind w:left="100" w:right="100" w:firstLine="0" w:firstLineChars="0"/>
+            </w:pPr>
+            <w:r>
+              <w:rPr>
+                <w:rFonts w:ascii="Helvetica" w:hAnsi="Helvetica" w:eastAsia="Helvetica" w:cs="Helvetica"/>
+                <w:i w:val="false"/>
+                <w:b w:val="false"/>
+                <w:u w:val="none"/>
+                <w:sz w:val="22"/>
+                <w:szCs w:val="22"/>
+                <w:color w:val="000000"/>
+              </w:rPr>
+              <w:t xml:space="preserve">0.034</w:t>
+            </w:r>
+          </w:p>
+        </w:tc>
+        <w:tc>
+          <w:tcPr>
+            <w:tcBorders>
+              <w:bottom w:val="none" w:sz="0" w:space="0" w:color="000000"/>
+              <w:top w:val="none" w:sz="0" w:space="0" w:color="000000"/>
+              <w:left w:val="none" w:sz="0" w:space="0" w:color="000000"/>
+              <w:right w:val="none" w:sz="0" w:space="0" w:color="000000"/>
+            </w:tcBorders>
+            <w:shd w:val="clear" w:color="auto" w:fill="FFFFFF"/>
+            <w:tcMar>
+              <w:top w:w="0" w:type="dxa"/>
+              <w:bottom w:w="0" w:type="dxa"/>
+              <w:left w:w="0" w:type="dxa"/>
+              <w:right w:w="0" w:type="dxa"/>
+            </w:tcMar>
+            <w:vAlign w:val="center"/>
+          </w:tcPr>
+          <w:p>
+            <w:pPr>
+              <w:pStyle w:val="Normal"/>
+              <w:jc w:val="right"/>
+              <w:pBdr>
+                <w:bottom w:val="none" w:sz="0" w:space="0" w:color="000000"/>
+                <w:top w:val="none" w:sz="0" w:space="0" w:color="000000"/>
+                <w:left w:val="none" w:sz="0" w:space="0" w:color="000000"/>
+                <w:right w:val="none" w:sz="0" w:space="0" w:color="000000"/>
+              </w:pBdr>
+              <w:spacing w:after="100" w:before="100" w:line="240"/>
+              <w:ind w:left="100" w:right="100" w:firstLine="0" w:firstLineChars="0"/>
+            </w:pPr>
+            <w:r>
+              <w:rPr>
+                <w:rFonts w:ascii="Helvetica" w:hAnsi="Helvetica" w:eastAsia="Helvetica" w:cs="Helvetica"/>
+                <w:i w:val="false"/>
+                <w:b w:val="false"/>
+                <w:u w:val="none"/>
+                <w:sz w:val="22"/>
+                <w:szCs w:val="22"/>
+                <w:color w:val="000000"/>
+              </w:rPr>
               <w:t xml:space="preserve">72</w:t>
             </w:r>
           </w:p>
@@ -9333,6 +12331,50 @@
                 <w:color w:val="000000"/>
               </w:rPr>
               <w:t xml:space="preserve">0.101</w:t>
+            </w:r>
+          </w:p>
+        </w:tc>
+        <w:tc>
+          <w:tcPr>
+            <w:tcBorders>
+              <w:bottom w:val="none" w:sz="0" w:space="0" w:color="000000"/>
+              <w:top w:val="none" w:sz="0" w:space="0" w:color="000000"/>
+              <w:left w:val="none" w:sz="0" w:space="0" w:color="000000"/>
+              <w:right w:val="none" w:sz="0" w:space="0" w:color="000000"/>
+            </w:tcBorders>
+            <w:shd w:val="clear" w:color="auto" w:fill="FFFFFF"/>
+            <w:tcMar>
+              <w:top w:w="0" w:type="dxa"/>
+              <w:bottom w:w="0" w:type="dxa"/>
+              <w:left w:w="0" w:type="dxa"/>
+              <w:right w:w="0" w:type="dxa"/>
+            </w:tcMar>
+            <w:vAlign w:val="center"/>
+          </w:tcPr>
+          <w:p>
+            <w:pPr>
+              <w:pStyle w:val="Normal"/>
+              <w:jc w:val="right"/>
+              <w:pBdr>
+                <w:bottom w:val="none" w:sz="0" w:space="0" w:color="000000"/>
+                <w:top w:val="none" w:sz="0" w:space="0" w:color="000000"/>
+                <w:left w:val="none" w:sz="0" w:space="0" w:color="000000"/>
+                <w:right w:val="none" w:sz="0" w:space="0" w:color="000000"/>
+              </w:pBdr>
+              <w:spacing w:after="100" w:before="100" w:line="240"/>
+              <w:ind w:left="100" w:right="100" w:firstLine="0" w:firstLineChars="0"/>
+            </w:pPr>
+            <w:r>
+              <w:rPr>
+                <w:rFonts w:ascii="Helvetica" w:hAnsi="Helvetica" w:eastAsia="Helvetica" w:cs="Helvetica"/>
+                <w:i w:val="false"/>
+                <w:b w:val="false"/>
+                <w:u w:val="none"/>
+                <w:sz w:val="22"/>
+                <w:szCs w:val="22"/>
+                <w:color w:val="000000"/>
+              </w:rPr>
+              <w:t xml:space="preserve">Inf</w:t>
             </w:r>
           </w:p>
         </w:tc>
@@ -9514,6 +12556,94 @@
                 <w:szCs w:val="22"/>
                 <w:color w:val="000000"/>
               </w:rPr>
+              <w:t xml:space="preserve">0.405</w:t>
+            </w:r>
+          </w:p>
+        </w:tc>
+        <w:tc>
+          <w:tcPr>
+            <w:tcBorders>
+              <w:bottom w:val="none" w:sz="0" w:space="0" w:color="000000"/>
+              <w:top w:val="none" w:sz="0" w:space="0" w:color="000000"/>
+              <w:left w:val="none" w:sz="0" w:space="0" w:color="000000"/>
+              <w:right w:val="none" w:sz="0" w:space="0" w:color="000000"/>
+            </w:tcBorders>
+            <w:shd w:val="clear" w:color="auto" w:fill="FFFFFF"/>
+            <w:tcMar>
+              <w:top w:w="0" w:type="dxa"/>
+              <w:bottom w:w="0" w:type="dxa"/>
+              <w:left w:w="0" w:type="dxa"/>
+              <w:right w:w="0" w:type="dxa"/>
+            </w:tcMar>
+            <w:vAlign w:val="center"/>
+          </w:tcPr>
+          <w:p>
+            <w:pPr>
+              <w:pStyle w:val="Normal"/>
+              <w:jc w:val="right"/>
+              <w:pBdr>
+                <w:bottom w:val="none" w:sz="0" w:space="0" w:color="000000"/>
+                <w:top w:val="none" w:sz="0" w:space="0" w:color="000000"/>
+                <w:left w:val="none" w:sz="0" w:space="0" w:color="000000"/>
+                <w:right w:val="none" w:sz="0" w:space="0" w:color="000000"/>
+              </w:pBdr>
+              <w:spacing w:after="100" w:before="100" w:line="240"/>
+              <w:ind w:left="100" w:right="100" w:firstLine="0" w:firstLineChars="0"/>
+            </w:pPr>
+            <w:r>
+              <w:rPr>
+                <w:rFonts w:ascii="Helvetica" w:hAnsi="Helvetica" w:eastAsia="Helvetica" w:cs="Helvetica"/>
+                <w:i w:val="false"/>
+                <w:b w:val="false"/>
+                <w:u w:val="none"/>
+                <w:sz w:val="22"/>
+                <w:szCs w:val="22"/>
+                <w:color w:val="000000"/>
+              </w:rPr>
+              <w:t xml:space="preserve">0.013</w:t>
+            </w:r>
+          </w:p>
+        </w:tc>
+        <w:tc>
+          <w:tcPr>
+            <w:tcBorders>
+              <w:bottom w:val="none" w:sz="0" w:space="0" w:color="000000"/>
+              <w:top w:val="none" w:sz="0" w:space="0" w:color="000000"/>
+              <w:left w:val="none" w:sz="0" w:space="0" w:color="000000"/>
+              <w:right w:val="none" w:sz="0" w:space="0" w:color="000000"/>
+            </w:tcBorders>
+            <w:shd w:val="clear" w:color="auto" w:fill="FFFFFF"/>
+            <w:tcMar>
+              <w:top w:w="0" w:type="dxa"/>
+              <w:bottom w:w="0" w:type="dxa"/>
+              <w:left w:w="0" w:type="dxa"/>
+              <w:right w:w="0" w:type="dxa"/>
+            </w:tcMar>
+            <w:vAlign w:val="center"/>
+          </w:tcPr>
+          <w:p>
+            <w:pPr>
+              <w:pStyle w:val="Normal"/>
+              <w:jc w:val="right"/>
+              <w:pBdr>
+                <w:bottom w:val="none" w:sz="0" w:space="0" w:color="000000"/>
+                <w:top w:val="none" w:sz="0" w:space="0" w:color="000000"/>
+                <w:left w:val="none" w:sz="0" w:space="0" w:color="000000"/>
+                <w:right w:val="none" w:sz="0" w:space="0" w:color="000000"/>
+              </w:pBdr>
+              <w:spacing w:after="100" w:before="100" w:line="240"/>
+              <w:ind w:left="100" w:right="100" w:firstLine="0" w:firstLineChars="0"/>
+            </w:pPr>
+            <w:r>
+              <w:rPr>
+                <w:rFonts w:ascii="Helvetica" w:hAnsi="Helvetica" w:eastAsia="Helvetica" w:cs="Helvetica"/>
+                <w:i w:val="false"/>
+                <w:b w:val="false"/>
+                <w:u w:val="none"/>
+                <w:sz w:val="22"/>
+                <w:szCs w:val="22"/>
+                <w:color w:val="000000"/>
+              </w:rPr>
               <w:t xml:space="preserve">72</w:t>
             </w:r>
           </w:p>
@@ -9735,6 +12865,50 @@
                 <w:color w:val="000000"/>
               </w:rPr>
               <w:t xml:space="preserve">0.090</w:t>
+            </w:r>
+          </w:p>
+        </w:tc>
+        <w:tc>
+          <w:tcPr>
+            <w:tcBorders>
+              <w:bottom w:val="none" w:sz="0" w:space="0" w:color="000000"/>
+              <w:top w:val="none" w:sz="0" w:space="0" w:color="000000"/>
+              <w:left w:val="none" w:sz="0" w:space="0" w:color="000000"/>
+              <w:right w:val="none" w:sz="0" w:space="0" w:color="000000"/>
+            </w:tcBorders>
+            <w:shd w:val="clear" w:color="auto" w:fill="FFFFFF"/>
+            <w:tcMar>
+              <w:top w:w="0" w:type="dxa"/>
+              <w:bottom w:w="0" w:type="dxa"/>
+              <w:left w:w="0" w:type="dxa"/>
+              <w:right w:w="0" w:type="dxa"/>
+            </w:tcMar>
+            <w:vAlign w:val="center"/>
+          </w:tcPr>
+          <w:p>
+            <w:pPr>
+              <w:pStyle w:val="Normal"/>
+              <w:jc w:val="right"/>
+              <w:pBdr>
+                <w:bottom w:val="none" w:sz="0" w:space="0" w:color="000000"/>
+                <w:top w:val="none" w:sz="0" w:space="0" w:color="000000"/>
+                <w:left w:val="none" w:sz="0" w:space="0" w:color="000000"/>
+                <w:right w:val="none" w:sz="0" w:space="0" w:color="000000"/>
+              </w:pBdr>
+              <w:spacing w:after="100" w:before="100" w:line="240"/>
+              <w:ind w:left="100" w:right="100" w:firstLine="0" w:firstLineChars="0"/>
+            </w:pPr>
+            <w:r>
+              <w:rPr>
+                <w:rFonts w:ascii="Helvetica" w:hAnsi="Helvetica" w:eastAsia="Helvetica" w:cs="Helvetica"/>
+                <w:i w:val="false"/>
+                <w:b w:val="false"/>
+                <w:u w:val="none"/>
+                <w:sz w:val="22"/>
+                <w:szCs w:val="22"/>
+                <w:color w:val="000000"/>
+              </w:rPr>
+              <w:t xml:space="preserve">Inf</w:t>
             </w:r>
           </w:p>
         </w:tc>
@@ -9916,6 +13090,94 @@
                 <w:szCs w:val="22"/>
                 <w:color w:val="000000"/>
               </w:rPr>
+              <w:t xml:space="preserve">0.471</w:t>
+            </w:r>
+          </w:p>
+        </w:tc>
+        <w:tc>
+          <w:tcPr>
+            <w:tcBorders>
+              <w:bottom w:val="none" w:sz="0" w:space="0" w:color="000000"/>
+              <w:top w:val="none" w:sz="0" w:space="0" w:color="000000"/>
+              <w:left w:val="none" w:sz="0" w:space="0" w:color="000000"/>
+              <w:right w:val="none" w:sz="0" w:space="0" w:color="000000"/>
+            </w:tcBorders>
+            <w:shd w:val="clear" w:color="auto" w:fill="FFFFFF"/>
+            <w:tcMar>
+              <w:top w:w="0" w:type="dxa"/>
+              <w:bottom w:w="0" w:type="dxa"/>
+              <w:left w:w="0" w:type="dxa"/>
+              <w:right w:w="0" w:type="dxa"/>
+            </w:tcMar>
+            <w:vAlign w:val="center"/>
+          </w:tcPr>
+          <w:p>
+            <w:pPr>
+              <w:pStyle w:val="Normal"/>
+              <w:jc w:val="right"/>
+              <w:pBdr>
+                <w:bottom w:val="none" w:sz="0" w:space="0" w:color="000000"/>
+                <w:top w:val="none" w:sz="0" w:space="0" w:color="000000"/>
+                <w:left w:val="none" w:sz="0" w:space="0" w:color="000000"/>
+                <w:right w:val="none" w:sz="0" w:space="0" w:color="000000"/>
+              </w:pBdr>
+              <w:spacing w:after="100" w:before="100" w:line="240"/>
+              <w:ind w:left="100" w:right="100" w:firstLine="0" w:firstLineChars="0"/>
+            </w:pPr>
+            <w:r>
+              <w:rPr>
+                <w:rFonts w:ascii="Helvetica" w:hAnsi="Helvetica" w:eastAsia="Helvetica" w:cs="Helvetica"/>
+                <w:i w:val="false"/>
+                <w:b w:val="false"/>
+                <w:u w:val="none"/>
+                <w:sz w:val="22"/>
+                <w:szCs w:val="22"/>
+                <w:color w:val="000000"/>
+              </w:rPr>
+              <w:t xml:space="preserve">0.017</w:t>
+            </w:r>
+          </w:p>
+        </w:tc>
+        <w:tc>
+          <w:tcPr>
+            <w:tcBorders>
+              <w:bottom w:val="none" w:sz="0" w:space="0" w:color="000000"/>
+              <w:top w:val="none" w:sz="0" w:space="0" w:color="000000"/>
+              <w:left w:val="none" w:sz="0" w:space="0" w:color="000000"/>
+              <w:right w:val="none" w:sz="0" w:space="0" w:color="000000"/>
+            </w:tcBorders>
+            <w:shd w:val="clear" w:color="auto" w:fill="FFFFFF"/>
+            <w:tcMar>
+              <w:top w:w="0" w:type="dxa"/>
+              <w:bottom w:w="0" w:type="dxa"/>
+              <w:left w:w="0" w:type="dxa"/>
+              <w:right w:w="0" w:type="dxa"/>
+            </w:tcMar>
+            <w:vAlign w:val="center"/>
+          </w:tcPr>
+          <w:p>
+            <w:pPr>
+              <w:pStyle w:val="Normal"/>
+              <w:jc w:val="right"/>
+              <w:pBdr>
+                <w:bottom w:val="none" w:sz="0" w:space="0" w:color="000000"/>
+                <w:top w:val="none" w:sz="0" w:space="0" w:color="000000"/>
+                <w:left w:val="none" w:sz="0" w:space="0" w:color="000000"/>
+                <w:right w:val="none" w:sz="0" w:space="0" w:color="000000"/>
+              </w:pBdr>
+              <w:spacing w:after="100" w:before="100" w:line="240"/>
+              <w:ind w:left="100" w:right="100" w:firstLine="0" w:firstLineChars="0"/>
+            </w:pPr>
+            <w:r>
+              <w:rPr>
+                <w:rFonts w:ascii="Helvetica" w:hAnsi="Helvetica" w:eastAsia="Helvetica" w:cs="Helvetica"/>
+                <w:i w:val="false"/>
+                <w:b w:val="false"/>
+                <w:u w:val="none"/>
+                <w:sz w:val="22"/>
+                <w:szCs w:val="22"/>
+                <w:color w:val="000000"/>
+              </w:rPr>
               <w:t xml:space="preserve">72</w:t>
             </w:r>
           </w:p>
@@ -10137,6 +13399,50 @@
                 <w:color w:val="000000"/>
               </w:rPr>
               <w:t xml:space="preserve">0.110</w:t>
+            </w:r>
+          </w:p>
+        </w:tc>
+        <w:tc>
+          <w:tcPr>
+            <w:tcBorders>
+              <w:bottom w:val="none" w:sz="0" w:space="0" w:color="000000"/>
+              <w:top w:val="none" w:sz="0" w:space="0" w:color="000000"/>
+              <w:left w:val="none" w:sz="0" w:space="0" w:color="000000"/>
+              <w:right w:val="none" w:sz="0" w:space="0" w:color="000000"/>
+            </w:tcBorders>
+            <w:shd w:val="clear" w:color="auto" w:fill="FFFFFF"/>
+            <w:tcMar>
+              <w:top w:w="0" w:type="dxa"/>
+              <w:bottom w:w="0" w:type="dxa"/>
+              <w:left w:w="0" w:type="dxa"/>
+              <w:right w:w="0" w:type="dxa"/>
+            </w:tcMar>
+            <w:vAlign w:val="center"/>
+          </w:tcPr>
+          <w:p>
+            <w:pPr>
+              <w:pStyle w:val="Normal"/>
+              <w:jc w:val="right"/>
+              <w:pBdr>
+                <w:bottom w:val="none" w:sz="0" w:space="0" w:color="000000"/>
+                <w:top w:val="none" w:sz="0" w:space="0" w:color="000000"/>
+                <w:left w:val="none" w:sz="0" w:space="0" w:color="000000"/>
+                <w:right w:val="none" w:sz="0" w:space="0" w:color="000000"/>
+              </w:pBdr>
+              <w:spacing w:after="100" w:before="100" w:line="240"/>
+              <w:ind w:left="100" w:right="100" w:firstLine="0" w:firstLineChars="0"/>
+            </w:pPr>
+            <w:r>
+              <w:rPr>
+                <w:rFonts w:ascii="Helvetica" w:hAnsi="Helvetica" w:eastAsia="Helvetica" w:cs="Helvetica"/>
+                <w:i w:val="false"/>
+                <w:b w:val="false"/>
+                <w:u w:val="none"/>
+                <w:sz w:val="22"/>
+                <w:szCs w:val="22"/>
+                <w:color w:val="000000"/>
+              </w:rPr>
+              <w:t xml:space="preserve">Inf</w:t>
             </w:r>
           </w:p>
         </w:tc>
@@ -10318,6 +13624,94 @@
                 <w:szCs w:val="22"/>
                 <w:color w:val="000000"/>
               </w:rPr>
+              <w:t xml:space="preserve">0.330</w:t>
+            </w:r>
+          </w:p>
+        </w:tc>
+        <w:tc>
+          <w:tcPr>
+            <w:tcBorders>
+              <w:bottom w:val="single" w:sz="12" w:space="0" w:color="666666"/>
+              <w:top w:val="none" w:sz="0" w:space="0" w:color="000000"/>
+              <w:left w:val="none" w:sz="0" w:space="0" w:color="000000"/>
+              <w:right w:val="none" w:sz="0" w:space="0" w:color="000000"/>
+            </w:tcBorders>
+            <w:shd w:val="clear" w:color="auto" w:fill="FFFFFF"/>
+            <w:tcMar>
+              <w:top w:w="0" w:type="dxa"/>
+              <w:bottom w:w="0" w:type="dxa"/>
+              <w:left w:w="0" w:type="dxa"/>
+              <w:right w:w="0" w:type="dxa"/>
+            </w:tcMar>
+            <w:vAlign w:val="center"/>
+          </w:tcPr>
+          <w:p>
+            <w:pPr>
+              <w:pStyle w:val="Normal"/>
+              <w:jc w:val="right"/>
+              <w:pBdr>
+                <w:bottom w:val="none" w:sz="0" w:space="0" w:color="000000"/>
+                <w:top w:val="none" w:sz="0" w:space="0" w:color="000000"/>
+                <w:left w:val="none" w:sz="0" w:space="0" w:color="000000"/>
+                <w:right w:val="none" w:sz="0" w:space="0" w:color="000000"/>
+              </w:pBdr>
+              <w:spacing w:after="100" w:before="100" w:line="240"/>
+              <w:ind w:left="100" w:right="100" w:firstLine="0" w:firstLineChars="0"/>
+            </w:pPr>
+            <w:r>
+              <w:rPr>
+                <w:rFonts w:ascii="Helvetica" w:hAnsi="Helvetica" w:eastAsia="Helvetica" w:cs="Helvetica"/>
+                <w:i w:val="false"/>
+                <w:b w:val="false"/>
+                <w:u w:val="none"/>
+                <w:sz w:val="22"/>
+                <w:szCs w:val="22"/>
+                <w:color w:val="000000"/>
+              </w:rPr>
+              <w:t xml:space="preserve">0.026</w:t>
+            </w:r>
+          </w:p>
+        </w:tc>
+        <w:tc>
+          <w:tcPr>
+            <w:tcBorders>
+              <w:bottom w:val="single" w:sz="12" w:space="0" w:color="666666"/>
+              <w:top w:val="none" w:sz="0" w:space="0" w:color="000000"/>
+              <w:left w:val="none" w:sz="0" w:space="0" w:color="000000"/>
+              <w:right w:val="none" w:sz="0" w:space="0" w:color="000000"/>
+            </w:tcBorders>
+            <w:shd w:val="clear" w:color="auto" w:fill="FFFFFF"/>
+            <w:tcMar>
+              <w:top w:w="0" w:type="dxa"/>
+              <w:bottom w:w="0" w:type="dxa"/>
+              <w:left w:w="0" w:type="dxa"/>
+              <w:right w:w="0" w:type="dxa"/>
+            </w:tcMar>
+            <w:vAlign w:val="center"/>
+          </w:tcPr>
+          <w:p>
+            <w:pPr>
+              <w:pStyle w:val="Normal"/>
+              <w:jc w:val="right"/>
+              <w:pBdr>
+                <w:bottom w:val="none" w:sz="0" w:space="0" w:color="000000"/>
+                <w:top w:val="none" w:sz="0" w:space="0" w:color="000000"/>
+                <w:left w:val="none" w:sz="0" w:space="0" w:color="000000"/>
+                <w:right w:val="none" w:sz="0" w:space="0" w:color="000000"/>
+              </w:pBdr>
+              <w:spacing w:after="100" w:before="100" w:line="240"/>
+              <w:ind w:left="100" w:right="100" w:firstLine="0" w:firstLineChars="0"/>
+            </w:pPr>
+            <w:r>
+              <w:rPr>
+                <w:rFonts w:ascii="Helvetica" w:hAnsi="Helvetica" w:eastAsia="Helvetica" w:cs="Helvetica"/>
+                <w:i w:val="false"/>
+                <w:b w:val="false"/>
+                <w:u w:val="none"/>
+                <w:sz w:val="22"/>
+                <w:szCs w:val="22"/>
+                <w:color w:val="000000"/>
+              </w:rPr>
               <w:t xml:space="preserve">72</w:t>
             </w:r>
           </w:p>
@@ -10539,6 +13933,50 @@
                 <w:color w:val="000000"/>
               </w:rPr>
               <w:t xml:space="preserve">0.126</w:t>
+            </w:r>
+          </w:p>
+        </w:tc>
+        <w:tc>
+          <w:tcPr>
+            <w:tcBorders>
+              <w:bottom w:val="single" w:sz="12" w:space="0" w:color="666666"/>
+              <w:top w:val="none" w:sz="0" w:space="0" w:color="000000"/>
+              <w:left w:val="none" w:sz="0" w:space="0" w:color="000000"/>
+              <w:right w:val="none" w:sz="0" w:space="0" w:color="000000"/>
+            </w:tcBorders>
+            <w:shd w:val="clear" w:color="auto" w:fill="FFFFFF"/>
+            <w:tcMar>
+              <w:top w:w="0" w:type="dxa"/>
+              <w:bottom w:w="0" w:type="dxa"/>
+              <w:left w:w="0" w:type="dxa"/>
+              <w:right w:w="0" w:type="dxa"/>
+            </w:tcMar>
+            <w:vAlign w:val="center"/>
+          </w:tcPr>
+          <w:p>
+            <w:pPr>
+              <w:pStyle w:val="Normal"/>
+              <w:jc w:val="right"/>
+              <w:pBdr>
+                <w:bottom w:val="none" w:sz="0" w:space="0" w:color="000000"/>
+                <w:top w:val="none" w:sz="0" w:space="0" w:color="000000"/>
+                <w:left w:val="none" w:sz="0" w:space="0" w:color="000000"/>
+                <w:right w:val="none" w:sz="0" w:space="0" w:color="000000"/>
+              </w:pBdr>
+              <w:spacing w:after="100" w:before="100" w:line="240"/>
+              <w:ind w:left="100" w:right="100" w:firstLine="0" w:firstLineChars="0"/>
+            </w:pPr>
+            <w:r>
+              <w:rPr>
+                <w:rFonts w:ascii="Helvetica" w:hAnsi="Helvetica" w:eastAsia="Helvetica" w:cs="Helvetica"/>
+                <w:i w:val="false"/>
+                <w:b w:val="false"/>
+                <w:u w:val="none"/>
+                <w:sz w:val="22"/>
+                <w:szCs w:val="22"/>
+                <w:color w:val="000000"/>
+              </w:rPr>
+              <w:t xml:space="preserve">Inf</w:t>
             </w:r>
           </w:p>
         </w:tc>

</xml_diff>